<commit_message>
fix: replace 'Fachanwalt für' line with KI_Verwalter_Titel in template
Co-Authored-By: Claude Opus 4.6 (1M context) <noreply@anthropic.com>
</commit_message>
<xml_diff>
--- a/gutachtenvorlagen/Gutachten Muster natürliche Person.docx
+++ b/gutachtenvorlagen/Gutachten Muster natürliche Person.docx
@@ -297,7 +297,7 @@
           <w:color w:val="000000"/>
           <w:lang w:eastAsia="de-DE"/>
         </w:rPr>
-        <w:t>Fachanwalt für</w:t>
+        <w:t>KI_Verwalter_Titel</w:t>
       </w:r>
     </w:p>
     <w:p>
@@ -330,31 +330,6 @@
           <w:highlight w:val="yellow"/>
           <w:lang w:eastAsia="de-DE"/>
         </w:rPr>
-      </w:r>
-    </w:p>
-    <w:p>
-      <w:pPr>
-        <w:tabs>
-          <w:tab w:val="left" w:pos="3969"/>
-        </w:tabs>
-        <w:suppressAutoHyphens w:val="0"/>
-        <w:autoSpaceDE w:val="0"/>
-        <w:adjustRightInd w:val="0"/>
-        <w:jc w:val="left"/>
-        <w:rPr>
-          <w:rFonts w:eastAsia="Times New Roman" w:cs="Arial"/>
-          <w:color w:val="000000"/>
-          <w:lang w:eastAsia="de-DE"/>
-        </w:rPr>
-      </w:pPr>
-      <w:r>
-        <w:rPr>
-          <w:rFonts w:eastAsia="Times New Roman" w:cs="Arial"/>
-          <w:color w:val="000000"/>
-          <w:lang w:eastAsia="de-DE"/>
-        </w:rPr>
-        <w:tab/>
-        <w:t>KI_Verwalter_Titel</w:t>
       </w:r>
     </w:p>
     <w:p>

</xml_diff>

<commit_message>
fix: expand cover page for natürliche Person (name, DOB, addresses, nachfolgend)
Real Gutachten shows full block: Name, geb., Privatadresse, Inh. Firma,
Betriebsstätte, 'nachfolgend Antragsteller'. Template only had firm + address.

Co-Authored-By: Claude Opus 4.6 (1M context) <noreply@anthropic.com>
</commit_message>
<xml_diff>
--- a/gutachtenvorlagen/Gutachten Muster natürliche Person.docx
+++ b/gutachtenvorlagen/Gutachten Muster natürliche Person.docx
@@ -81,7 +81,7 @@
           <w:b/>
           <w:highlight w:val="yellow"/>
         </w:rPr>
-        <w:t>KI_Akte_Bezeichnung</w:t>
+        <w:t>KI_Schuldner_NameVorname</w:t>
       </w:r>
       <w:bookmarkEnd w:id="2"/>
       <w:proofErr w:type="spellEnd"/>
@@ -98,14 +98,188 @@
         <w:jc w:val="center"/>
         <w:rPr>
           <w:b/>
-        </w:rPr>
-      </w:pPr>
+          <w:highlight w:val="yellow"/>
+        </w:rPr>
+      </w:pPr>
+      <w:bookmarkStart w:id="2" w:name="KI_Akte_Bezeichnung"/>
+      <w:proofErr w:type="spellStart"/>
       <w:r>
         <w:rPr>
           <w:b/>
           <w:highlight w:val="yellow"/>
         </w:rPr>
+        <w:t>geb. KI_Schuldner_Geburtsdatum</w:t>
+      </w:r>
+      <w:bookmarkEnd w:id="2"/>
+      <w:proofErr w:type="spellEnd"/>
+      <w:r>
+        <w:rPr>
+          <w:b/>
+          <w:highlight w:val="yellow"/>
+        </w:rPr>
+        <w:t xml:space="preserve"> </w:t>
+      </w:r>
+    </w:p>
+    <w:p>
+      <w:pPr>
+        <w:jc w:val="center"/>
+        <w:rPr>
+          <w:b/>
+          <w:highlight w:val="yellow"/>
+        </w:rPr>
+      </w:pPr>
+      <w:bookmarkStart w:id="2" w:name="KI_Akte_Bezeichnung"/>
+      <w:proofErr w:type="spellStart"/>
+      <w:r>
+        <w:rPr>
+          <w:b/>
+          <w:highlight w:val="yellow"/>
+        </w:rPr>
         <w:t>KI_Schuldner_Adr</w:t>
+      </w:r>
+      <w:bookmarkEnd w:id="2"/>
+      <w:proofErr w:type="spellEnd"/>
+      <w:r>
+        <w:rPr>
+          <w:b/>
+          <w:highlight w:val="yellow"/>
+        </w:rPr>
+        <w:t xml:space="preserve"> </w:t>
+      </w:r>
+    </w:p>
+    <w:p>
+      <w:pPr>
+        <w:jc w:val="center"/>
+        <w:rPr>
+          <w:b/>
+          <w:highlight w:val="yellow"/>
+        </w:rPr>
+      </w:pPr>
+      <w:bookmarkStart w:id="2" w:name="KI_Akte_Bezeichnung"/>
+      <w:proofErr w:type="spellStart"/>
+      <w:r>
+        <w:rPr>
+          <w:b/>
+          <w:highlight w:val="yellow"/>
+        </w:rPr>
+        <w:t/>
+      </w:r>
+      <w:bookmarkEnd w:id="2"/>
+      <w:proofErr w:type="spellEnd"/>
+      <w:r>
+        <w:rPr>
+          <w:b/>
+          <w:highlight w:val="yellow"/>
+        </w:rPr>
+        <w:t xml:space="preserve"> </w:t>
+      </w:r>
+    </w:p>
+    <w:p>
+      <w:pPr>
+        <w:jc w:val="center"/>
+        <w:rPr>
+          <w:b/>
+          <w:highlight w:val="yellow"/>
+        </w:rPr>
+      </w:pPr>
+      <w:bookmarkStart w:id="2" w:name="KI_Akte_Bezeichnung"/>
+      <w:proofErr w:type="spellStart"/>
+      <w:r>
+        <w:rPr>
+          <w:b/>
+          <w:highlight w:val="yellow"/>
+        </w:rPr>
+        <w:t>Inh. KI_Schuldner_Firma</w:t>
+      </w:r>
+      <w:bookmarkEnd w:id="2"/>
+      <w:proofErr w:type="spellEnd"/>
+      <w:r>
+        <w:rPr>
+          <w:b/>
+          <w:highlight w:val="yellow"/>
+        </w:rPr>
+        <w:t xml:space="preserve"> </w:t>
+      </w:r>
+    </w:p>
+    <w:p>
+      <w:pPr>
+        <w:jc w:val="center"/>
+        <w:rPr>
+          <w:b/>
+          <w:highlight w:val="yellow"/>
+        </w:rPr>
+      </w:pPr>
+      <w:bookmarkStart w:id="2" w:name="KI_Akte_Bezeichnung"/>
+      <w:proofErr w:type="spellStart"/>
+      <w:r>
+        <w:rPr>
+          <w:b/>
+          <w:highlight w:val="yellow"/>
+        </w:rPr>
+        <w:t>KI_Schuldner_Betriebsstaette</w:t>
+      </w:r>
+      <w:bookmarkEnd w:id="2"/>
+      <w:proofErr w:type="spellEnd"/>
+      <w:r>
+        <w:rPr>
+          <w:b/>
+          <w:highlight w:val="yellow"/>
+        </w:rPr>
+        <w:t xml:space="preserve"> </w:t>
+      </w:r>
+    </w:p>
+    <w:p>
+      <w:pPr>
+        <w:jc w:val="center"/>
+        <w:rPr>
+          <w:b/>
+          <w:highlight w:val="yellow"/>
+        </w:rPr>
+      </w:pPr>
+      <w:bookmarkStart w:id="2" w:name="KI_Akte_Bezeichnung"/>
+      <w:proofErr w:type="spellStart"/>
+      <w:r>
+        <w:rPr>
+          <w:b/>
+          <w:highlight w:val="yellow"/>
+        </w:rPr>
+        <w:t/>
+      </w:r>
+      <w:bookmarkEnd w:id="2"/>
+      <w:proofErr w:type="spellEnd"/>
+      <w:r>
+        <w:rPr>
+          <w:b/>
+          <w:highlight w:val="yellow"/>
+        </w:rPr>
+        <w:t xml:space="preserve"> </w:t>
+      </w:r>
+    </w:p>
+    <w:p>
+      <w:pPr>
+        <w:jc w:val="center"/>
+        <w:rPr>
+          <w:b/>
+          <w:highlight w:val="yellow"/>
+        </w:rPr>
+      </w:pPr>
+      <w:bookmarkStart w:id="2" w:name="KI_Akte_Bezeichnung"/>
+      <w:proofErr w:type="spellStart"/>
+      <w:r>
+        <w:rPr>
+          <w:b/>
+          <w:highlight w:val="yellow"/>
+        </w:rPr>
+        <w:t>- nachfolgend „Antragsteller" -</w:t>
+      </w:r>
+      <w:bookmarkEnd w:id="2"/>
+      <w:proofErr w:type="spellEnd"/>
+      <w:r>
+        <w:rPr>
+          <w:b/>
+          <w:highlight w:val="yellow"/>
+        </w:rPr>
+        <w:t xml:space="preserve"> </w:t>
       </w:r>
     </w:p>
     <w:p/>

</xml_diff>

<commit_message>
feat: golden template for natürliche Person from real Gutachten
Co-Authored-By: Claude Opus 4.6 (1M context) <noreply@anthropic.com>
</commit_message>
<xml_diff>
--- a/gutachtenvorlagen/Gutachten Muster natürliche Person.docx
+++ b/gutachtenvorlagen/Gutachten Muster natürliche Person.docx
@@ -52,17 +52,7 @@
         <w:jc w:val="center"/>
       </w:pPr>
       <w:r>
-        <w:t xml:space="preserve">in dem Insolvenzantragsverfahren über das Vermögen </w:t>
-      </w:r>
-      <w:bookmarkStart w:id="1" w:name="KI_Schuldner_Artikel"/>
-      <w:proofErr w:type="spellStart"/>
-      <w:r>
-        <w:t>KI_Schuldner_Artikel</w:t>
-      </w:r>
-      <w:bookmarkEnd w:id="1"/>
-      <w:proofErr w:type="spellEnd"/>
-      <w:r>
-        <w:t xml:space="preserve"> </w:t>
+        <w:t>in dem Insolvenzantragsverfahren über das Vermögen KI_Schuldner_des_der</w:t>
       </w:r>
     </w:p>
     <w:p/>
@@ -326,20 +316,7 @@
         <w:jc w:val="center"/>
       </w:pPr>
       <w:r>
-        <w:t>-</w:t>
-      </w:r>
-      <w:bookmarkStart w:id="4" w:name="KI_Akte_GerichtAZ"/>
-      <w:proofErr w:type="spellStart"/>
-      <w:r>
-        <w:t>KI_Akte_GerichtAZ</w:t>
-      </w:r>
-      <w:bookmarkEnd w:id="4"/>
-      <w:proofErr w:type="spellEnd"/>
-      <w:r>
-        <w:t xml:space="preserve"> -</w:t>
-      </w:r>
-      <w:r>
-        <w:br w:type="page"/>
+        <w:t>-KI_Akte_GerichtAZ-</w:t>
       </w:r>
     </w:p>
     <w:p>
@@ -788,26 +765,7 @@
           <w:rFonts w:eastAsia="Times New Roman" w:cs="Arial"/>
           <w:lang w:eastAsia="de-DE"/>
         </w:rPr>
-      </w:r>
-      <w:r>
-        <w:rPr>
-          <w:rFonts w:eastAsia="Times New Roman" w:cs="Arial"/>
-          <w:b/>
-          <w:lang w:eastAsia="de-DE"/>
-        </w:rPr>
-      </w:r>
-      <w:r>
-        <w:rPr>
-          <w:rFonts w:eastAsia="Times New Roman" w:cs="Arial"/>
-          <w:lang w:eastAsia="de-DE"/>
-        </w:rPr>
-      </w:r>
-      <w:r>
-        <w:rPr>
-          <w:rFonts w:eastAsia="Times New Roman" w:cs="Arial"/>
-          <w:highlight w:val="yellow"/>
-          <w:lang w:eastAsia="de-DE"/>
-        </w:rPr>
+        <w:t xml:space="preserve">                                          Datum: 	[[SLOT_001: Datum Gutachten]]</w:t>
       </w:r>
     </w:p>
     <w:p>
@@ -886,6 +844,7 @@
           <w:highlight w:val="yellow"/>
           <w:lang w:eastAsia="de-DE"/>
         </w:rPr>
+        <w:t>[[SLOT_002: Ergebnis Punkt 1 - Feststellung Zahlungsunfähigkeit/Überschuldung]]</w:t>
       </w:r>
     </w:p>
     <w:p>
@@ -925,6 +884,7 @@
           <w:highlight w:val="yellow"/>
           <w:lang w:eastAsia="de-DE"/>
         </w:rPr>
+        <w:t>[[SLOT_003: Ergebnis Punkt 2 - Verfahrenskostendeckung]]</w:t>
       </w:r>
     </w:p>
     <w:p>
@@ -965,6 +925,7 @@
           <w:highlight w:val="yellow"/>
           <w:lang w:eastAsia="de-DE"/>
         </w:rPr>
+        <w:t>[[SLOT_004: Ergebnis Punkt 3 - Empfehlung Sicherungsmaßnahmen]]</w:t>
       </w:r>
     </w:p>
     <w:p>
@@ -1000,6 +961,7 @@
           <w:highlight w:val="yellow"/>
           <w:lang w:eastAsia="de-DE"/>
         </w:rPr>
+        <w:t>[[SLOT_005: Ggf. Empfehlung Eröffnungsdatum und Verfahrenskostenstundung]]</w:t>
       </w:r>
     </w:p>
     <w:p>
@@ -1052,42 +1014,6 @@
           <w:lang w:eastAsia="de-DE"/>
         </w:rPr>
       </w:pPr>
-      <w:r>
-        <w:rPr>
-          <w:rFonts w:eastAsia="Times New Roman" w:cs="Arial"/>
-          <w:noProof/>
-          <w:lang w:eastAsia="de-DE"/>
-        </w:rPr>
-      </w:r>
-      <w:r>
-        <w:rPr>
-          <w:rFonts w:eastAsia="Times New Roman" w:cs="Arial"/>
-          <w:noProof/>
-          <w:highlight w:val="yellow"/>
-          <w:lang w:eastAsia="de-DE"/>
-        </w:rPr>
-      </w:r>
-      <w:r>
-        <w:rPr>
-          <w:rFonts w:eastAsia="Times New Roman" w:cs="Arial"/>
-          <w:noProof/>
-          <w:lang w:eastAsia="de-DE"/>
-        </w:rPr>
-      </w:r>
-      <w:r>
-        <w:rPr>
-          <w:rFonts w:eastAsia="Times New Roman" w:cs="Arial"/>
-          <w:noProof/>
-          <w:lang w:eastAsia="de-DE"/>
-        </w:rPr>
-      </w:r>
-      <w:r>
-        <w:rPr>
-          <w:rFonts w:eastAsia="Times New Roman" w:cs="Arial"/>
-          <w:noProof/>
-          <w:lang w:eastAsia="de-DE"/>
-        </w:rPr>
-      </w:r>
     </w:p>
     <w:p>
       <w:pPr>
@@ -1118,7 +1044,13 @@
           <w:lang w:eastAsia="de-DE"/>
         </w:rPr>
       </w:pPr>
-      <w:r>
+    </w:p>
+    <w:p>
+      <w:pPr>
+        <w:suppressAutoHyphens w:val="0"/>
+        <w:autoSpaceDE w:val="0"/>
+        <w:adjustRightInd w:val="0"/>
+        <w:jc w:val="center"/>
         <w:rPr>
           <w:rFonts w:eastAsia="Times New Roman" w:cs="Arial"/>
           <w:b/>
@@ -1126,8 +1058,7 @@
           <w:noProof/>
           <w:lang w:eastAsia="de-DE"/>
         </w:rPr>
-        <w:t>das Insolvenzverfahren</w:t>
-      </w:r>
+      </w:pPr>
     </w:p>
     <w:p>
       <w:pPr>
@@ -1143,65 +1074,6 @@
           <w:lang w:eastAsia="de-DE"/>
         </w:rPr>
       </w:pPr>
-      <w:r>
-        <w:rPr>
-          <w:rFonts w:eastAsia="Times New Roman" w:cs="Arial"/>
-          <w:b/>
-          <w:bCs/>
-          <w:noProof/>
-          <w:lang w:eastAsia="de-DE"/>
-        </w:rPr>
-      </w:r>
-      <w:r>
-        <w:rPr>
-          <w:rFonts w:eastAsia="Times New Roman" w:cs="Arial"/>
-          <w:b/>
-          <w:bCs/>
-          <w:noProof/>
-          <w:highlight w:val="yellow"/>
-          <w:lang w:eastAsia="de-DE"/>
-        </w:rPr>
-      </w:r>
-      <w:r>
-        <w:rPr>
-          <w:rFonts w:eastAsia="Times New Roman" w:cs="Arial"/>
-          <w:b/>
-          <w:bCs/>
-          <w:noProof/>
-          <w:lang w:eastAsia="de-DE"/>
-        </w:rPr>
-      </w:r>
-    </w:p>
-    <w:p>
-      <w:pPr>
-        <w:suppressAutoHyphens w:val="0"/>
-        <w:autoSpaceDE w:val="0"/>
-        <w:adjustRightInd w:val="0"/>
-        <w:jc w:val="center"/>
-        <w:rPr>
-          <w:rFonts w:eastAsia="Times New Roman" w:cs="Arial"/>
-          <w:b/>
-          <w:bCs/>
-          <w:noProof/>
-          <w:lang w:eastAsia="de-DE"/>
-        </w:rPr>
-      </w:pPr>
-      <w:r>
-        <w:rPr>
-          <w:rFonts w:eastAsia="Times New Roman" w:cs="Arial"/>
-          <w:b/>
-          <w:bCs/>
-          <w:noProof/>
-          <w:lang w:eastAsia="de-DE"/>
-        </w:rPr>
-        <w:t>zu eröffnen.</w:t>
-      </w:r>
-      <w:r>
-        <w:rPr>
-          <w:b/>
-        </w:rPr>
-        <w:br w:type="page"/>
-      </w:r>
     </w:p>
     <w:p>
       <w:pPr>
@@ -6252,62 +6124,7 @@
         <w:ind w:left="709"/>
       </w:pPr>
       <w:r>
-        <w:t xml:space="preserve">Das Amtsgericht </w:t>
-      </w:r>
-      <w:bookmarkStart w:id="13" w:name="KI_Gericht_Ort_003"/>
-      <w:proofErr w:type="spellStart"/>
-      <w:r>
-        <w:t>KI_Gericht_Ort</w:t>
-      </w:r>
-      <w:bookmarkEnd w:id="13"/>
-      <w:proofErr w:type="spellEnd"/>
-      <w:r>
-        <w:t xml:space="preserve"> </w:t>
-      </w:r>
-      <w:r>
-        <w:t>hat</w:t>
-      </w:r>
-      <w:r>
-        <w:t xml:space="preserve"> </w:t>
-      </w:r>
-      <w:bookmarkStart w:id="14" w:name="KI_Verwalter_den_die"/>
-      <w:proofErr w:type="spellStart"/>
-      <w:r>
-        <w:t>KI_Verwalter_den_die</w:t>
-      </w:r>
-      <w:bookmarkEnd w:id="14"/>
-      <w:proofErr w:type="spellEnd"/>
-      <w:r>
-        <w:t xml:space="preserve"> </w:t>
-      </w:r>
-      <w:bookmarkStart w:id="15" w:name="KI_Verwalter_Unterzeichner"/>
-      <w:proofErr w:type="spellStart"/>
-      <w:r>
-        <w:t>KI_Verwalter_Unterzeichner</w:t>
-      </w:r>
-      <w:bookmarkEnd w:id="15"/>
-      <w:proofErr w:type="spellEnd"/>
-      <w:r>
-        <w:t xml:space="preserve"> </w:t>
-      </w:r>
-      <w:r>
-        <w:t>mit Beschluss vom</w:t>
-      </w:r>
-      <w:r>
-        <w:t xml:space="preserve"> </w:t>
-      </w:r>
-      <w:bookmarkStart w:id="16" w:name="KI_Akte_LastGAVV"/>
-      <w:proofErr w:type="spellStart"/>
-      <w:r>
-        <w:t>KI_Akte_BeschlussDat</w:t>
-      </w:r>
-      <w:bookmarkEnd w:id="16"/>
-      <w:proofErr w:type="spellEnd"/>
-      <w:r>
-        <w:t xml:space="preserve"> </w:t>
-      </w:r>
-      <w:r>
-        <w:t xml:space="preserve">beauftragt, in dem </w:t>
+        <w:t>Das Amtsgericht KI_Gericht_Ort hat KI_Verwalter_den_die Unterzeichner mit Beschluss vom KI_Akte_BeschlussDat beauftragt, in dem</w:t>
       </w:r>
     </w:p>
     <w:p/>
@@ -6316,17 +6133,7 @@
         <w:jc w:val="center"/>
       </w:pPr>
       <w:r>
-        <w:t xml:space="preserve">Insolvenzantragsverfahren über das Vermögen </w:t>
-      </w:r>
-      <w:bookmarkStart w:id="17" w:name="KI_Schuldner_Artikel_002"/>
-      <w:proofErr w:type="spellStart"/>
-      <w:r>
-        <w:t>KI_Schuldner_Artikel</w:t>
-      </w:r>
-      <w:bookmarkEnd w:id="17"/>
-      <w:proofErr w:type="spellEnd"/>
-      <w:r>
-        <w:t xml:space="preserve"> </w:t>
+        <w:t>Insolvenzantragsverfahren über das Vermögen KI_Schuldner_des_der</w:t>
       </w:r>
     </w:p>
     <w:p>
@@ -6341,39 +6148,33 @@
           <w:b/>
         </w:rPr>
       </w:pPr>
-      <w:bookmarkStart w:id="18" w:name="KI_Akte_Bezeichnung_002"/>
-      <w:proofErr w:type="spellStart"/>
       <w:r>
         <w:rPr>
           <w:b/>
         </w:rPr>
-        <w:t>KI_Akte_Bezeichnung</w:t>
-      </w:r>
-      <w:bookmarkEnd w:id="18"/>
-      <w:proofErr w:type="spellEnd"/>
-    </w:p>
-    <w:p/>
+        <w:t>KI_Schuldner_NameVorname</w:t>
+      </w:r>
+    </w:p>
+    <w:p>
+      <w:r>
+        <w:t>geb. KI_Schuldner_Geburtsdatum</w:t>
+      </w:r>
+    </w:p>
     <w:p>
       <w:pPr>
         <w:ind w:left="709"/>
       </w:pPr>
       <w:r>
-        <w:t xml:space="preserve">ein schriftliches Gutachten zur Beantwortung </w:t>
-      </w:r>
-      <w:r>
-        <w:t>folgen</w:t>
-      </w:r>
-      <w:r>
-        <w:t>der Fragen zu erstellen</w:t>
-      </w:r>
-      <w:r>
-        <w:t>:</w:t>
+        <w:t>KI_Schuldner_Adr</w:t>
       </w:r>
     </w:p>
     <w:p>
       <w:pPr>
         <w:ind w:left="709"/>
       </w:pPr>
+      <w:r>
+        <w:t/>
+      </w:r>
     </w:p>
     <w:p>
       <w:pPr>
@@ -6383,82 +6184,106 @@
         <w:rPr>
           <w:highlight w:val="yellow"/>
         </w:rPr>
-      </w:r>
-      <w:r/>
+        <w:t>Inh. KI_Schuldner_der_die KI_Schuldner_Firma</w:t>
+      </w:r>
     </w:p>
     <w:p>
       <w:pPr>
         <w:ind w:left="709"/>
       </w:pPr>
+      <w:r>
+        <w:t>KI_Schuldner_Betriebsstaette</w:t>
+      </w:r>
     </w:p>
     <w:p>
       <w:pPr>
         <w:ind w:left="709"/>
       </w:pPr>
-      <w:r>
-        <w:t xml:space="preserve">In Erfüllung </w:t>
-      </w:r>
-      <w:r>
-        <w:t>dieses</w:t>
-      </w:r>
-      <w:r>
-        <w:t xml:space="preserve"> Auftrages ha</w:t>
-      </w:r>
-      <w:r>
-        <w:t>t</w:t>
-      </w:r>
-      <w:r>
-        <w:t xml:space="preserve"> </w:t>
-      </w:r>
-      <w:bookmarkStart w:id="19" w:name="KI_Verwalter_der_die"/>
-      <w:proofErr w:type="spellStart"/>
-      <w:r>
-        <w:t>KI_Verwalter_der_die</w:t>
-      </w:r>
-      <w:bookmarkEnd w:id="19"/>
-      <w:proofErr w:type="spellEnd"/>
-      <w:r>
-        <w:t xml:space="preserve"> </w:t>
-      </w:r>
-      <w:bookmarkStart w:id="20" w:name="KI_Verwalter_Unterzeichner_002"/>
-      <w:proofErr w:type="spellStart"/>
-      <w:r>
-        <w:t>KI_Verwalter_Unterzeichner</w:t>
-      </w:r>
-      <w:bookmarkEnd w:id="20"/>
-      <w:proofErr w:type="spellEnd"/>
-      <w:r>
-        <w:t xml:space="preserve"> </w:t>
-      </w:r>
-      <w:r>
-        <w:t>das nachfolgende Gutachten erstellt</w:t>
-      </w:r>
-      <w:r>
-        <w:t xml:space="preserve"> </w:t>
-      </w:r>
-      <w:r>
-        <w:rPr>
-          <w:highlight w:val="yellow"/>
-        </w:rPr>
-        <w:t>und erstatte</w:t>
-      </w:r>
-      <w:r>
-        <w:rPr>
-          <w:highlight w:val="yellow"/>
-        </w:rPr>
-        <w:t>t</w:t>
-      </w:r>
-      <w:r>
-        <w:rPr>
-          <w:highlight w:val="yellow"/>
-        </w:rPr>
-        <w:t xml:space="preserve"> hiermit Bericht über den Verlauf des Antragsverfahrens</w:t>
-      </w:r>
-      <w:r>
-        <w:t>:</w:t>
-      </w:r>
-      <w:r>
-        <w:br w:type="page"/>
+    </w:p>
+    <w:p>
+      <w:pPr>
+        <w:ind w:left="709"/>
+      </w:pPr>
+      <w:r>
+        <w:t>- nachfolgend „Antragsteller“ -</w:t>
+      </w:r>
+    </w:p>
+    <w:p>
+      <w:pPr>
+        <w:ind w:left="709"/>
+      </w:pPr>
+    </w:p>
+    <w:p>
+      <w:pPr>
+        <w:ind w:left="709"/>
+      </w:pPr>
+      <w:r>
+        <w:t>ein schriftliches Gutachten zur Beantwortung folgender Fragen zu erstellen:</w:t>
+      </w:r>
+    </w:p>
+    <w:p>
+      <w:pPr>
+        <w:ind w:left="709"/>
+      </w:pPr>
+    </w:p>
+    <w:p>
+      <w:pPr>
+        <w:ind w:left="709"/>
+      </w:pPr>
+      <w:r>
+        <w:t>a) Liegen Tatsachen vor, wonach der Schluss auf (drohende) Zahlungsunfähigkeit des Antragstellers gerechtfertigt ist?</w:t>
+      </w:r>
+    </w:p>
+    <w:p>
+      <w:pPr>
+        <w:ind w:left="709"/>
+      </w:pPr>
+    </w:p>
+    <w:p>
+      <w:pPr>
+        <w:ind w:left="709"/>
+      </w:pPr>
+      <w:r>
+        <w:t>Falls ja.</w:t>
+      </w:r>
+    </w:p>
+    <w:p>
+      <w:pPr>
+        <w:ind w:left="709"/>
+      </w:pPr>
+    </w:p>
+    <w:p>
+      <w:pPr>
+        <w:ind w:left="709"/>
+      </w:pPr>
+      <w:r>
+        <w:t>b) Ist eine die Verfahrenskosten (§ 54 InsO) deckende Masse vorhanden? Dabei sind auch insolvenzspezifische Ansprüche (Haftung von verantwortlichen Organen, Anfechtungsansprüche) zu prüfen und darzustellen, wann die Zahlungsunfähigkeit / Überschuldung eingetreten ist.</w:t>
+      </w:r>
+    </w:p>
+    <w:p>
+      <w:pPr>
+        <w:ind w:left="709"/>
+      </w:pPr>
+    </w:p>
+    <w:p>
+      <w:pPr>
+        <w:ind w:left="709"/>
+      </w:pPr>
+      <w:r>
+        <w:t>c) Erscheinen vorläufige Anordnungen zur Sicherung der Masse (allgemeines Veräußerungsverbot, vorläufige Verwaltung, Postsperre usw.) erforderlich?</w:t>
+      </w:r>
+    </w:p>
+    <w:p>
+      <w:pPr>
+        <w:ind w:left="709"/>
+      </w:pPr>
+    </w:p>
+    <w:p>
+      <w:pPr>
+        <w:ind w:left="709"/>
+      </w:pPr>
+      <w:r>
+        <w:t>In Erfüllung dieses Auftrages hat KI_Verwalter_der_die Unterzeichner das nachfolgende Gutachten erstellt und erstattet hiermit Bericht über den Verlauf des Antragsverfahrens:</w:t>
       </w:r>
     </w:p>
     <w:p>
@@ -6486,7 +6311,13 @@
         <w:ind w:left="709"/>
       </w:pPr>
       <w:r>
-        <w:t>Dieses Gutachten basiert auf der Auswertung der Gerichtsakten, Gesprächen mit den unten genannten Auskunftspersonen, Inaugenscheinnahmen, den Ergebnissen des beauftragten Sachverständigen und den von KI_Schuldner_dem_der KI_Schuldner_Schuldnerin vorgelegten Unterlagen.</w:t>
+        <w:t>Dem Beschluss ging ein [[SLOT_006: Eigenantrag/Fremdantrag]] KI_Schuldner_des_der Antragstellers vom KI_Akte_VorlVerfahrDat voraus, welcher am [[SLOT_007: Eingangsdatum bei Gericht]] bei dem Amtsgericht KI_Gericht_Ort einging.</w:t>
+      </w:r>
+    </w:p>
+    <w:p/>
+    <w:p>
+      <w:r>
+        <w:t>Dieses Gutachten basiert auf der Auswertung der Gerichtsakten, Gesprächen mit den unten genannten Auskunftspersonen, Inaugenscheinnahmen, den Ergebnissen des beauftragten Sachverständigen und den vom Antragsteller vorgelegten Unterlagen.</w:t>
       </w:r>
     </w:p>
     <w:p>
@@ -6517,31 +6348,9 @@
       <w:pPr>
         <w:ind w:left="709"/>
       </w:pPr>
-      <w:r/>
-      <w:r/>
-      <w:bookmarkStart w:id="23" w:name="KI_Verwalter_dem_der"/>
-      <w:proofErr w:type="spellStart"/>
-      <w:r/>
-      <w:bookmarkEnd w:id="23"/>
-      <w:proofErr w:type="spellEnd"/>
-      <w:r/>
-      <w:bookmarkStart w:id="24" w:name="KI_Verwalter_Unterzeichner_003"/>
-      <w:proofErr w:type="spellStart"/>
-      <w:r/>
-      <w:bookmarkEnd w:id="24"/>
-      <w:proofErr w:type="spellEnd"/>
-      <w:r/>
-      <w:r/>
-      <w:r/>
-      <w:r>
-        <w:rPr>
-          <w:highlight w:val="yellow"/>
-        </w:rPr>
-      </w:r>
-      <w:r/>
-      <w:r/>
-      <w:r/>
-      <w:r/>
+      <w:r>
+        <w:t>Das Insolvenzgericht hat KI_Verwalter_dem_der Unterzeichner am [[SLOT_008: Datum Aktenübersendung]] die Gerichtsakte übersandt.</w:t>
+      </w:r>
     </w:p>
     <w:p>
       <w:pPr>
@@ -6552,58 +6361,9 @@
       <w:pPr>
         <w:ind w:left="709"/>
       </w:pPr>
-      <w:r/>
-      <w:r>
-        <w:rPr>
-          <w:highlight w:val="yellow"/>
-        </w:rPr>
-      </w:r>
-      <w:r/>
-      <w:r/>
-      <w:r/>
-      <w:r/>
-      <w:bookmarkStart w:id="25" w:name="KI_Verwalter_dem_der_002"/>
-      <w:proofErr w:type="spellStart"/>
-      <w:r/>
-      <w:bookmarkEnd w:id="25"/>
-      <w:proofErr w:type="spellEnd"/>
-      <w:r/>
-      <w:bookmarkStart w:id="26" w:name="KI_Verwalter_Unterzeichner_004"/>
-      <w:proofErr w:type="spellStart"/>
-      <w:r/>
-      <w:bookmarkEnd w:id="26"/>
-      <w:proofErr w:type="spellEnd"/>
-      <w:r/>
-      <w:r/>
-      <w:r>
-        <w:rPr>
-          <w:highlight w:val="yellow"/>
-        </w:rPr>
-      </w:r>
-      <w:r/>
-      <w:r>
-        <w:rPr>
-          <w:highlight w:val="yellow"/>
-        </w:rPr>
-      </w:r>
-      <w:r/>
-      <w:r/>
-      <w:r/>
-      <w:r>
-        <w:rPr>
-          <w:highlight w:val="yellow"/>
-        </w:rPr>
-      </w:r>
-      <w:r/>
-      <w:r/>
-      <w:r/>
-      <w:r/>
-      <w:r>
-        <w:rPr>
-          <w:highlight w:val="yellow"/>
-        </w:rPr>
-      </w:r>
-      <w:r/>
+      <w:r>
+        <w:t>[[SLOT_009: Beschreibung des ersten Besprechungstermins mit dem Schuldner]]</w:t>
+      </w:r>
     </w:p>
     <w:p>
       <w:pPr>
@@ -6615,61 +6375,11 @@
         <w:ind w:left="709"/>
         <w:textAlignment w:val="auto"/>
       </w:pPr>
-      <w:bookmarkStart w:id="27" w:name="KI_Verwalter_Der_Die_Groß"/>
-      <w:proofErr w:type="spellStart"/>
-      <w:r>
-        <w:rPr>
-          <w:highlight w:val="yellow"/>
-        </w:rPr>
-        <w:t>KI_Verwalter_Der_Die_Groß</w:t>
-      </w:r>
-      <w:bookmarkEnd w:id="27"/>
-      <w:proofErr w:type="spellEnd"/>
-      <w:r>
-        <w:rPr>
-          <w:highlight w:val="yellow"/>
-        </w:rPr>
-        <w:t xml:space="preserve"> </w:t>
-      </w:r>
-      <w:bookmarkStart w:id="28" w:name="KI_Verwalter_Unterzeichner_005"/>
-      <w:proofErr w:type="spellStart"/>
-      <w:r>
-        <w:rPr>
-          <w:highlight w:val="yellow"/>
-        </w:rPr>
-        <w:t>KI_Verwalter_Unterzeichner</w:t>
-      </w:r>
-      <w:bookmarkEnd w:id="28"/>
-      <w:proofErr w:type="spellEnd"/>
-      <w:r>
-        <w:rPr>
-          <w:highlight w:val="yellow"/>
-        </w:rPr>
-        <w:t xml:space="preserve"> </w:t>
-      </w:r>
-      <w:r>
-        <w:rPr>
-          <w:highlight w:val="yellow"/>
-        </w:rPr>
-        <w:t>hat</w:t>
-      </w:r>
-      <w:r>
-        <w:rPr>
-          <w:highlight w:val="yellow"/>
-        </w:rPr>
-        <w:t xml:space="preserve"> eine elektronische Datensicherung an den Servern des Betriebes durchführen</w:t>
-      </w:r>
-      <w:r>
-        <w:rPr>
-          <w:highlight w:val="yellow"/>
-        </w:rPr>
-        <w:t xml:space="preserve"> lassen</w:t>
-      </w:r>
-      <w:r>
-        <w:rPr>
-          <w:highlight w:val="yellow"/>
-        </w:rPr>
-        <w:t>. Die Daten liegen auf einer externen Festplatte und sind im VMDK Format gespeichert.</w:t>
+      <w:r>
+        <w:rPr>
+          <w:highlight w:val="yellow"/>
+        </w:rPr>
+        <w:t>Dem Unterzeichner standen darüber hinaus folgende Unterlagen zur Einsichtnahme zur Verfügung:</w:t>
       </w:r>
     </w:p>
     <w:p>
@@ -6682,92 +6392,8 @@
       <w:pPr>
         <w:ind w:left="709"/>
       </w:pPr>
-      <w:commentRangeStart w:id="29"/>
-      <w:r>
-        <w:t>Der Steuerberater</w:t>
-      </w:r>
-      <w:r>
-        <w:t xml:space="preserve"> </w:t>
-      </w:r>
-      <w:bookmarkStart w:id="30" w:name="KI_Schuldner_Artikel_003"/>
-      <w:proofErr w:type="spellStart"/>
-      <w:r>
-        <w:t>KI_Schuldner_Artikel</w:t>
-      </w:r>
-      <w:bookmarkEnd w:id="30"/>
-      <w:proofErr w:type="spellEnd"/>
-      <w:r>
-        <w:t xml:space="preserve"> </w:t>
-      </w:r>
-      <w:bookmarkStart w:id="31" w:name="KI_Schuldners_Schuldnerin"/>
-      <w:proofErr w:type="spellStart"/>
-      <w:r>
-        <w:t>KI_Schuldners_Schuldnerin</w:t>
-      </w:r>
-      <w:bookmarkEnd w:id="31"/>
-      <w:proofErr w:type="spellEnd"/>
-      <w:r>
-        <w:t xml:space="preserve"> </w:t>
-      </w:r>
-      <w:r>
-        <w:rPr>
-          <w:highlight w:val="yellow"/>
-        </w:rPr>
-        <w:t>hat</w:t>
-      </w:r>
-      <w:r>
-        <w:t xml:space="preserve"> für</w:t>
-      </w:r>
-      <w:r>
-        <w:t xml:space="preserve"> </w:t>
-      </w:r>
-      <w:bookmarkStart w:id="32" w:name="KI_Verwalter_den_die_002"/>
-      <w:proofErr w:type="spellStart"/>
-      <w:r>
-        <w:t>KI_Verwalter_den_die</w:t>
-      </w:r>
-      <w:bookmarkEnd w:id="32"/>
-      <w:proofErr w:type="spellEnd"/>
-      <w:r>
-        <w:t xml:space="preserve"> </w:t>
-      </w:r>
-      <w:bookmarkStart w:id="33" w:name="KI_Verwalter_Unterzeichner_006"/>
-      <w:proofErr w:type="spellStart"/>
-      <w:r>
-        <w:t>KI_Verwalter_Unterzeichner</w:t>
-      </w:r>
-      <w:bookmarkEnd w:id="33"/>
-      <w:proofErr w:type="spellEnd"/>
-      <w:r>
-        <w:t xml:space="preserve"> b</w:t>
-      </w:r>
-      <w:r>
-        <w:t xml:space="preserve">eim Finanzamt sowie den Sozialversicherungsträgern </w:t>
-      </w:r>
-      <w:r>
-        <w:rPr>
-          <w:highlight w:val="yellow"/>
-        </w:rPr>
-        <w:t>(bezeichnen)</w:t>
-      </w:r>
-      <w:r>
-        <w:t xml:space="preserve"> einen </w:t>
-      </w:r>
-      <w:r>
-        <w:t>Kontoauszug</w:t>
-      </w:r>
-      <w:r>
-        <w:t xml:space="preserve"> der letzten 4 Jahre</w:t>
-      </w:r>
-      <w:r>
-        <w:t xml:space="preserve"> angefordert. Diese Kontoauszüge liegen vor.</w:t>
-      </w:r>
-      <w:commentRangeEnd w:id="29"/>
-      <w:r>
-        <w:rPr>
-          <w:rStyle w:val="Kommentarzeichen"/>
-        </w:rPr>
-        <w:commentReference w:id="29"/>
+      <w:r>
+        <w:t>[[SLOT_010: Liste der Unterlagen (Buchungskonten, OPOS-Listen, Grundbuchauszug, Creditreform etc.)]]</w:t>
       </w:r>
     </w:p>
     <w:p/>
@@ -6798,18 +6424,13 @@
         <w:rPr>
           <w:highlight w:val="yellow"/>
         </w:rPr>
-      </w:r>
-      <w:proofErr w:type="spellStart"/>
-      <w:r>
-        <w:rPr>
-          <w:highlight w:val="yellow"/>
-        </w:rPr>
-      </w:r>
-      <w:proofErr w:type="spellEnd"/>
-      <w:r>
-        <w:rPr>
-          <w:highlight w:val="yellow"/>
-        </w:rPr>
+        <w:t>Darüber hinaus standen KI_Verwalter_dem_der Unterzeichner folgende Personen für Auskünfte zur Verfügung:</w:t>
+      </w:r>
+    </w:p>
+    <w:p/>
+    <w:p>
+      <w:r>
+        <w:t>[[SLOT_011: Liste der Auskunftspersonen mit Name und Organisation]]</w:t>
       </w:r>
     </w:p>
     <w:p/>
@@ -7161,7 +6782,7 @@
                 <w:sz w:val="18"/>
                 <w:szCs w:val="18"/>
               </w:rPr>
-              <w:t xml:space="preserve">KI_Schuldner_Name</w:t>
+              <w:t>KI_Schuldner_NameVorname</w:t>
             </w:r>
           </w:p>
         </w:tc>
@@ -7233,15 +6854,8 @@
               <w:rPr>
                 <w:b/>
               </w:rPr>
-              <w:t>Anschrift</w:t>
+              <w:t>Anschrift (privat)</w:t>
             </w:r>
-          </w:p>
-          <w:p>
-            <w:pPr>
-              <w:rPr>
-                <w:b/>
-              </w:rPr>
-            </w:pPr>
           </w:p>
         </w:tc>
         <w:tc>
@@ -7308,14 +6922,9 @@
               <w:right w:val="single" w:sz="4" w:space="0" w:color="auto"/>
             </w:tcBorders>
           </w:tcPr>
-          <w:p/>
           <w:p>
             <w:r>
-              <w:rPr>
-                <w:sz w:val="18"/>
-                <w:szCs w:val="18"/>
-              </w:rPr>
-              <w:t xml:space="preserve">KI_Schuldner_HRB</w:t>
+              <w:t>[[SLOT_012: Handelsregister ja/nein mit Details]]</w:t>
             </w:r>
           </w:p>
         </w:tc>
@@ -7395,7 +7004,7 @@
                 <w:sz w:val="18"/>
                 <w:szCs w:val="18"/>
               </w:rPr>
-              <w:t xml:space="preserve">KI_Forderungen_Gesamt</w:t>
+              <w:t>KI_Forderungen_Gesamt / KI_Forderungen_Gesichert / [[SLOT_013: Nachrangig]]</w:t>
             </w:r>
           </w:p>
         </w:tc>
@@ -7442,19 +7051,8 @@
                 <w:rFonts w:cs="Arial"/>
               </w:rPr>
             </w:pPr>
-          </w:p>
-          <w:p>
-            <w:pPr>
-              <w:rPr>
-                <w:rFonts w:cs="Arial"/>
-              </w:rPr>
-            </w:pPr>
             <w:r>
-              <w:rPr>
-                <w:sz w:val="18"/>
-                <w:szCs w:val="18"/>
-              </w:rPr>
-              <w:t xml:space="preserve">KI_Antragsteller_Name</w:t>
+              <w:t>KI_Antragsteller_Name [[SLOT_014: Eigenantrag/Fremdantrag Details]]</w:t>
             </w:r>
           </w:p>
         </w:tc>
@@ -7565,127 +7163,8 @@
                 <w:rFonts w:cs="Arial"/>
               </w:rPr>
             </w:pPr>
-          </w:p>
-        </w:tc>
-      </w:tr>
-      <w:tr>
-        <w:tc>
-          <w:tcPr>
-            <w:tcW w:w="3431" w:type="dxa"/>
-            <w:tcBorders>
-              <w:top w:val="single" w:sz="4" w:space="0" w:color="auto"/>
-              <w:left w:val="single" w:sz="4" w:space="0" w:color="auto"/>
-              <w:bottom w:val="single" w:sz="4" w:space="0" w:color="auto"/>
-              <w:right w:val="single" w:sz="4" w:space="0" w:color="auto"/>
-            </w:tcBorders>
-          </w:tcPr>
-          <w:p>
-            <w:pPr>
-              <w:rPr>
-                <w:b/>
-              </w:rPr>
-            </w:pPr>
             <w:r>
-              <w:rPr>
-                <w:b/>
-              </w:rPr>
-              <w:t>Eigenverwaltung</w:t>
-            </w:r>
-          </w:p>
-          <w:p>
-            <w:pPr>
-              <w:rPr>
-                <w:b/>
-              </w:rPr>
-            </w:pPr>
-          </w:p>
-        </w:tc>
-        <w:tc>
-          <w:tcPr>
-            <w:tcW w:w="4814" w:type="dxa"/>
-            <w:tcBorders>
-              <w:top w:val="single" w:sz="4" w:space="0" w:color="auto"/>
-              <w:left w:val="single" w:sz="4" w:space="0" w:color="auto"/>
-              <w:bottom w:val="single" w:sz="4" w:space="0" w:color="auto"/>
-              <w:right w:val="single" w:sz="4" w:space="0" w:color="auto"/>
-            </w:tcBorders>
-          </w:tcPr>
-          <w:p>
-            <w:pPr>
-              <w:rPr>
-                <w:rFonts w:cs="Arial"/>
-              </w:rPr>
-            </w:pPr>
-          </w:p>
-        </w:tc>
-      </w:tr>
-      <w:tr>
-        <w:tc>
-          <w:tcPr>
-            <w:tcW w:w="3431" w:type="dxa"/>
-            <w:tcBorders>
-              <w:top w:val="single" w:sz="4" w:space="0" w:color="auto"/>
-              <w:left w:val="single" w:sz="4" w:space="0" w:color="auto"/>
-              <w:bottom w:val="single" w:sz="4" w:space="0" w:color="auto"/>
-              <w:right w:val="single" w:sz="4" w:space="0" w:color="auto"/>
-            </w:tcBorders>
-          </w:tcPr>
-          <w:p>
-            <w:pPr>
-              <w:rPr>
-                <w:b/>
-              </w:rPr>
-            </w:pPr>
-            <w:r>
-              <w:rPr>
-                <w:b/>
-              </w:rPr>
-              <w:t>Geschäftszweig</w:t>
-            </w:r>
-          </w:p>
-          <w:p>
-            <w:pPr>
-              <w:rPr>
-                <w:b/>
-              </w:rPr>
-            </w:pPr>
-          </w:p>
-        </w:tc>
-        <w:tc>
-          <w:tcPr>
-            <w:tcW w:w="4814" w:type="dxa"/>
-            <w:tcBorders>
-              <w:top w:val="single" w:sz="4" w:space="0" w:color="auto"/>
-              <w:left w:val="single" w:sz="4" w:space="0" w:color="auto"/>
-              <w:bottom w:val="single" w:sz="4" w:space="0" w:color="auto"/>
-              <w:right w:val="single" w:sz="4" w:space="0" w:color="auto"/>
-            </w:tcBorders>
-          </w:tcPr>
-          <w:p>
-            <w:pPr>
-              <w:rPr>
-                <w:rFonts w:cs="Arial"/>
-              </w:rPr>
-            </w:pPr>
-            <w:r>
-              <w:rPr>
-                <w:rFonts w:cs="Arial"/>
-                <w:highlight w:val="yellow"/>
-              </w:rPr>
-              <w:t>[[SLOT_172: Branche]]</w:t>
-            </w:r>
-          </w:p>
-          <w:p>
-            <w:pPr>
-              <w:rPr>
-                <w:rFonts w:cs="Arial"/>
-              </w:rPr>
-            </w:pPr>
-            <w:r>
-              <w:rPr>
-                <w:rFonts w:cs="Arial"/>
-              </w:rPr>
-              <w:t>https://de.statista.com/statistik/kategorien/</w:t>
+              <w:t>[[SLOT_015: Internationaler Bezug]]</w:t>
             </w:r>
           </w:p>
         </w:tc>
@@ -7711,7 +7190,7 @@
               <w:rPr>
                 <w:b/>
               </w:rPr>
-              <w:t>Unternehmensgegenstand</w:t>
+              <w:t>Eigenverwaltung</w:t>
             </w:r>
           </w:p>
           <w:p>
@@ -7739,11 +7218,123 @@
               </w:rPr>
             </w:pPr>
             <w:r>
+              <w:t>[[SLOT_016: Eigenverwaltung]]</w:t>
+            </w:r>
+          </w:p>
+        </w:tc>
+      </w:tr>
+      <w:tr>
+        <w:tc>
+          <w:tcPr>
+            <w:tcW w:w="3431" w:type="dxa"/>
+            <w:tcBorders>
+              <w:top w:val="single" w:sz="4" w:space="0" w:color="auto"/>
+              <w:left w:val="single" w:sz="4" w:space="0" w:color="auto"/>
+              <w:bottom w:val="single" w:sz="4" w:space="0" w:color="auto"/>
+              <w:right w:val="single" w:sz="4" w:space="0" w:color="auto"/>
+            </w:tcBorders>
+          </w:tcPr>
+          <w:p>
+            <w:pPr>
+              <w:rPr>
+                <w:b/>
+              </w:rPr>
+            </w:pPr>
+            <w:r>
+              <w:rPr>
+                <w:b/>
+              </w:rPr>
+              <w:t>Geschäftszweig</w:t>
+            </w:r>
+          </w:p>
+          <w:p>
+            <w:pPr>
+              <w:rPr>
+                <w:b/>
+              </w:rPr>
+            </w:pPr>
+          </w:p>
+        </w:tc>
+        <w:tc>
+          <w:tcPr>
+            <w:tcW w:w="4814" w:type="dxa"/>
+            <w:tcBorders>
+              <w:top w:val="single" w:sz="4" w:space="0" w:color="auto"/>
+              <w:left w:val="single" w:sz="4" w:space="0" w:color="auto"/>
+              <w:bottom w:val="single" w:sz="4" w:space="0" w:color="auto"/>
+              <w:right w:val="single" w:sz="4" w:space="0" w:color="auto"/>
+            </w:tcBorders>
+          </w:tcPr>
+          <w:p>
+            <w:pPr>
+              <w:rPr>
+                <w:rFonts w:cs="Arial"/>
+              </w:rPr>
+            </w:pPr>
+            <w:r>
+              <w:rPr>
+                <w:rFonts w:cs="Arial"/>
+                <w:highlight w:val="yellow"/>
+              </w:rPr>
+              <w:t>[[SLOT_017: Geschäftszweig und Unternehmensgegenstand]]</w:t>
+            </w:r>
+          </w:p>
+        </w:tc>
+      </w:tr>
+      <w:tr>
+        <w:tc>
+          <w:tcPr>
+            <w:tcW w:w="3431" w:type="dxa"/>
+            <w:tcBorders>
+              <w:top w:val="single" w:sz="4" w:space="0" w:color="auto"/>
+              <w:left w:val="single" w:sz="4" w:space="0" w:color="auto"/>
+              <w:bottom w:val="single" w:sz="4" w:space="0" w:color="auto"/>
+              <w:right w:val="single" w:sz="4" w:space="0" w:color="auto"/>
+            </w:tcBorders>
+          </w:tcPr>
+          <w:p>
+            <w:pPr>
+              <w:rPr>
+                <w:b/>
+              </w:rPr>
+            </w:pPr>
+            <w:r>
+              <w:rPr>
+                <w:b/>
+              </w:rPr>
+              <w:t>Unternehmensgegenstand</w:t>
+            </w:r>
+          </w:p>
+          <w:p>
+            <w:pPr>
+              <w:rPr>
+                <w:b/>
+              </w:rPr>
+            </w:pPr>
+          </w:p>
+        </w:tc>
+        <w:tc>
+          <w:tcPr>
+            <w:tcW w:w="4814" w:type="dxa"/>
+            <w:tcBorders>
+              <w:top w:val="single" w:sz="4" w:space="0" w:color="auto"/>
+              <w:left w:val="single" w:sz="4" w:space="0" w:color="auto"/>
+              <w:bottom w:val="single" w:sz="4" w:space="0" w:color="auto"/>
+              <w:right w:val="single" w:sz="4" w:space="0" w:color="auto"/>
+            </w:tcBorders>
+          </w:tcPr>
+          <w:p>
+            <w:pPr>
+              <w:rPr>
+                <w:rFonts w:cs="Arial"/>
+              </w:rPr>
+            </w:pPr>
+            <w:r>
               <w:rPr>
                 <w:sz w:val="18"/>
                 <w:szCs w:val="18"/>
               </w:rPr>
-              <w:t xml:space="preserve">KI_Schuldner_Firma</w:t>
+              <w:t>[[SLOT_018: Unternehmensgegenstand Beschreibung]]</w:t>
             </w:r>
           </w:p>
         </w:tc>
@@ -7854,6 +7445,9 @@
                 <w:rFonts w:cs="Arial"/>
               </w:rPr>
             </w:pPr>
+            <w:r>
+              <w:t>[[SLOT_019: Betriebsrat ja/nein]]</w:t>
+            </w:r>
           </w:p>
         </w:tc>
       </w:tr>
@@ -7903,7 +7497,7 @@
                 <w:rFonts w:cs="Arial"/>
                 <w:highlight w:val="yellow"/>
               </w:rPr>
-              <w:t>Ja/Nein</w:t>
+              <w:t>[[SLOT_020: Restschuldbefreiung ja/nein]]</w:t>
             </w:r>
           </w:p>
         </w:tc>
@@ -7969,7 +7563,7 @@
                 <w:rFonts w:cs="Arial"/>
                 <w:highlight w:val="yellow"/>
               </w:rPr>
-              <w:t>Ja/Nein</w:t>
+              <w:t>[[SLOT_021: Verfahrenskostenstundung ja/nein]]</w:t>
             </w:r>
           </w:p>
         </w:tc>
@@ -8090,15 +7684,8 @@
               <w:rPr>
                 <w:b/>
               </w:rPr>
-              <w:t>Steuer-Nr.</w:t>
+              <w:t>Steuer-Nr. / USt-ID-Nr.</w:t>
             </w:r>
-          </w:p>
-          <w:p>
-            <w:pPr>
-              <w:rPr>
-                <w:b/>
-              </w:rPr>
-            </w:pPr>
           </w:p>
         </w:tc>
         <w:tc>
@@ -8122,7 +7709,7 @@
                 <w:sz w:val="18"/>
                 <w:szCs w:val="18"/>
               </w:rPr>
-              <w:t xml:space="preserve">KI_Steuernummer</w:t>
+              <w:t>KI_Steuernummer / [[SLOT_022: USt-ID]]</w:t>
             </w:r>
           </w:p>
         </w:tc>
@@ -8190,6 +7777,9 @@
                 <w:bCs/>
               </w:rPr>
             </w:pPr>
+            <w:r>
+              <w:t>[[SLOT_023: Wirtschaftsjahr]] / [[SLOT_024: USt-Versteuerung]]</w:t>
+            </w:r>
           </w:p>
         </w:tc>
       </w:tr>
@@ -8241,6 +7831,9 @@
                 <w:bCs/>
               </w:rPr>
             </w:pPr>
+            <w:r>
+              <w:t>[[SLOT_025: Steuerliche Organschaft]]</w:t>
+            </w:r>
           </w:p>
         </w:tc>
       </w:tr>
@@ -8406,7 +7999,7 @@
                 <w:sz w:val="18"/>
                 <w:szCs w:val="18"/>
               </w:rPr>
-              <w:t xml:space="preserve">KI_Schuldner_Geburtsdaten</w:t>
+              <w:t>KI_Schuldner_Geburtsdaten / [[SLOT_026: Geburtsort]]</w:t>
             </w:r>
           </w:p>
         </w:tc>
@@ -8461,6 +8054,9 @@
                 <w:bCs/>
               </w:rPr>
             </w:pPr>
+            <w:r>
+              <w:t>[[SLOT_027: Konfession]]</w:t>
+            </w:r>
           </w:p>
         </w:tc>
       </w:tr>
@@ -8586,21 +8182,7 @@
                 <w:bCs/>
                 <w:highlight w:val="yellow"/>
               </w:rPr>
-              <w:t>[[SLOT_173: mit Geburtsdatum]]</w:t>
-            </w:r>
-          </w:p>
-          <w:p>
-            <w:pPr>
-              <w:rPr>
-                <w:bCs/>
-              </w:rPr>
-            </w:pPr>
-            <w:r>
-              <w:rPr>
-                <w:bCs/>
-                <w:highlight w:val="yellow"/>
-              </w:rPr>
-              <w:t>[[SLOT_174: Angabe ob Unterhalt geleistet wird]]</w:t>
+              <w:t>[[SLOT_028: Kinder und Unterhalt Details mit Geburtsdaten]]</w:t>
             </w:r>
           </w:p>
         </w:tc>
@@ -8660,7 +8242,7 @@
                 <w:bCs/>
                 <w:highlight w:val="yellow"/>
               </w:rPr>
-              <w:t>[[SLOT_175: mit Geburtsdatum und Angabe von Getrennt]]</w:t>
+              <w:t>[[SLOT_029: Familienstand Details mit Geburtsdatum]]</w:t>
             </w:r>
           </w:p>
         </w:tc>
@@ -9021,6 +8603,9 @@
                 <w:bCs/>
               </w:rPr>
             </w:pPr>
+            <w:r>
+              <w:t>[[SLOT_030: Berufsgenossenschaft und Mitgliedsnummer]]</w:t>
+            </w:r>
           </w:p>
         </w:tc>
       </w:tr>
@@ -9127,6 +8712,9 @@
                 <w:bCs/>
               </w:rPr>
             </w:pPr>
+            <w:r>
+              <w:t>[[SLOT_031: Erste bilanzielle Überschuldung]]</w:t>
+            </w:r>
           </w:p>
         </w:tc>
       </w:tr>
@@ -9246,6 +8834,9 @@
                 <w:bCs/>
               </w:rPr>
             </w:pPr>
+            <w:r>
+              <w:t>[[SLOT_032: Wirtschaftlich Berechtigter nach Transparenzregister]]</w:t>
+            </w:r>
           </w:p>
         </w:tc>
       </w:tr>
@@ -9364,7 +8955,7 @@
                 <w:sz w:val="18"/>
                 <w:szCs w:val="18"/>
               </w:rPr>
-              <w:t xml:space="preserve">KI_Anderkonto</w:t>
+              <w:t>KI_ANDERKONTO_IBAN / KI_Anderkonto_Bank</w:t>
             </w:r>
           </w:p>
         </w:tc>
@@ -9464,89 +9055,9 @@
       <w:pPr>
         <w:ind w:left="709"/>
       </w:pPr>
-      <w:r/>
-      <w:r>
-        <w:rPr>
-          <w:highlight w:val="yellow"/>
-        </w:rPr>
-      </w:r>
-      <w:r/>
-      <w:r>
-        <w:rPr>
-          <w:highlight w:val="yellow"/>
-        </w:rPr>
-      </w:r>
-      <w:r/>
-      <w:r>
-        <w:rPr>
-          <w:highlight w:val="yellow"/>
-        </w:rPr>
-      </w:r>
-      <w:r/>
-      <w:r/>
-      <w:r/>
-      <w:r>
-        <w:rPr>
-          <w:highlight w:val="yellow"/>
-        </w:rPr>
-      </w:r>
-      <w:r/>
-      <w:r>
-        <w:rPr>
-          <w:highlight w:val="yellow"/>
-        </w:rPr>
-      </w:r>
-      <w:r/>
-      <w:r/>
-      <w:bookmarkStart w:id="53" w:name="KI_Verwalter_den_die_003"/>
-      <w:proofErr w:type="spellStart"/>
-      <w:r/>
-      <w:bookmarkEnd w:id="53"/>
-      <w:proofErr w:type="spellEnd"/>
-      <w:r/>
-      <w:bookmarkStart w:id="54" w:name="KI_Verwalter_Unterzeichner_009"/>
-      <w:proofErr w:type="spellStart"/>
-      <w:r/>
-      <w:bookmarkEnd w:id="54"/>
-      <w:proofErr w:type="spellEnd"/>
-      <w:r/>
-      <w:bookmarkStart w:id="55" w:name="KI_Verwalter_zum_zur"/>
-      <w:proofErr w:type="spellStart"/>
-      <w:r/>
-      <w:r/>
-      <w:bookmarkEnd w:id="55"/>
-      <w:proofErr w:type="spellEnd"/>
-      <w:r/>
-      <w:r>
-        <w:rPr>
-          <w:highlight w:val="yellow"/>
-        </w:rPr>
-      </w:r>
-      <w:r>
-        <w:rPr>
-          <w:highlight w:val="yellow"/>
-        </w:rPr>
-      </w:r>
-      <w:bookmarkStart w:id="56" w:name="KI_Akte_VorlVerfahrDat"/>
-      <w:proofErr w:type="spellStart"/>
-      <w:r>
-        <w:rPr>
-          <w:highlight w:val="yellow"/>
-        </w:rPr>
-      </w:r>
-      <w:bookmarkEnd w:id="56"/>
-      <w:proofErr w:type="spellEnd"/>
-      <w:r>
-        <w:rPr>
-          <w:highlight w:val="yellow"/>
-        </w:rPr>
-      </w:r>
-      <w:r>
-        <w:rPr>
-          <w:highlight w:val="yellow"/>
-        </w:rPr>
-      </w:r>
-      <w:r/>
+      <w:r>
+        <w:t>[[SLOT_033: Verfahrenshistorie - Antragsdatum, Eingangsdatum, Beschlussdatum, Bestellung, ggf. Restschuldbefreiung, ggf. Verfahrenskostenstundung]]</w:t>
+      </w:r>
     </w:p>
     <w:p>
       <w:pPr>
@@ -9967,19 +9478,9 @@
       <w:pPr>
         <w:ind w:left="709"/>
       </w:pPr>
-      <w:r/>
-      <w:r>
-        <w:rPr>
-          <w:highlight w:val="yellow"/>
-        </w:rPr>
-      </w:r>
-      <w:r/>
-      <w:r>
-        <w:rPr>
-          <w:highlight w:val="yellow"/>
-        </w:rPr>
-      </w:r>
-      <w:r/>
+      <w:r>
+        <w:t>[[SLOT_034: Konkrete Zuständigkeitsbegründung - wo ist der Geschäftsbetrieb, Gerichtsbezirk]]</w:t>
+      </w:r>
     </w:p>
     <w:p>
       <w:pPr>
@@ -9990,13 +9491,9 @@
       <w:pPr>
         <w:ind w:left="349" w:firstLine="360"/>
       </w:pPr>
-      <w:r/>
-      <w:r>
-        <w:rPr>
-          <w:highlight w:val="yellow"/>
-        </w:rPr>
-      </w:r>
-      <w:r/>
+      <w:r>
+        <w:t>Das Amtsgericht KI_Gericht_Ort ist daher örtlich zuständig.</w:t>
+      </w:r>
     </w:p>
     <w:p/>
     <w:p>
@@ -10022,54 +9519,9 @@
       <w:pPr>
         <w:ind w:left="709"/>
       </w:pPr>
-      <w:r/>
-      <w:r>
-        <w:rPr>
-          <w:highlight w:val="yellow"/>
-        </w:rPr>
-      </w:r>
-      <w:r/>
-      <w:r>
-        <w:rPr>
-          <w:highlight w:val="yellow"/>
-        </w:rPr>
-      </w:r>
-      <w:r/>
-      <w:r/>
-      <w:bookmarkStart w:id="63" w:name="KI_Verwalter_Der_Die_Groß_002"/>
-      <w:proofErr w:type="spellStart"/>
-      <w:r/>
-      <w:bookmarkEnd w:id="63"/>
-      <w:proofErr w:type="spellEnd"/>
-      <w:r/>
-      <w:bookmarkStart w:id="64" w:name="KI_Verwalter_Unterzeichner_010"/>
-      <w:proofErr w:type="spellStart"/>
-      <w:r/>
-      <w:bookmarkEnd w:id="64"/>
-      <w:proofErr w:type="spellEnd"/>
-      <w:r/>
-      <w:r/>
-      <w:r/>
-      <w:bookmarkStart w:id="65" w:name="KI_Verwalter_zum_zur_002"/>
-      <w:proofErr w:type="spellStart"/>
-      <w:r/>
-      <w:bookmarkEnd w:id="65"/>
-      <w:proofErr w:type="spellEnd"/>
-      <w:r/>
-      <w:r/>
-      <w:r>
-        <w:rPr>
-          <w:highlight w:val="yellow"/>
-        </w:rPr>
-      </w:r>
-      <w:r>
-        <w:rPr>
-          <w:highlight w:val="yellow"/>
-        </w:rPr>
-      </w:r>
-      <w:r/>
-      <w:r/>
-      <w:r/>
+      <w:r>
+        <w:t>[[SLOT_035: Sicherungsmaßnahmen - Beschluss, Datum, Maßnahmen (Zustimmungsvorbehalt, Zwangsvollstreckungsverbot, Kontensperre etc.)]]</w:t>
+      </w:r>
     </w:p>
     <w:p/>
     <w:p>
@@ -10095,49 +9547,9 @@
       <w:pPr>
         <w:ind w:left="709"/>
       </w:pPr>
-      <w:bookmarkStart w:id="67" w:name="_Hlk156465393"/>
-      <w:r/>
-      <w:r>
-        <w:rPr>
-          <w:highlight w:val="yellow"/>
-        </w:rPr>
-      </w:r>
-      <w:r/>
-      <w:r/>
-      <w:bookmarkStart w:id="68" w:name="KI_Verwalter_der_die_002"/>
-      <w:proofErr w:type="spellStart"/>
-      <w:r/>
-      <w:bookmarkEnd w:id="68"/>
-      <w:proofErr w:type="spellEnd"/>
-      <w:r/>
-      <w:bookmarkStart w:id="69" w:name="KI_Verwalter_Unterzeichner_011"/>
-      <w:proofErr w:type="spellStart"/>
-      <w:r/>
-      <w:bookmarkEnd w:id="69"/>
-      <w:proofErr w:type="spellEnd"/>
-      <w:r/>
-      <w:r/>
-      <w:r>
-        <w:rPr>
-          <w:highlight w:val="yellow"/>
-        </w:rPr>
-      </w:r>
-      <w:r>
-        <w:rPr>
-          <w:highlight w:val="yellow"/>
-        </w:rPr>
-      </w:r>
-      <w:r/>
-      <w:r/>
-      <w:r/>
-      <w:r/>
-      <w:r/>
-      <w:r>
-        <w:rPr>
-          <w:highlight w:val="yellow"/>
-        </w:rPr>
-      </w:r>
-      <w:r/>
+      <w:r>
+        <w:t>[[SLOT_036: Einzelermächtigungen des vorläufigen Insolvenzverwalters]]</w:t>
+      </w:r>
     </w:p>
     <w:bookmarkEnd w:id="67"/>
     <w:p/>
@@ -10174,13 +9586,9 @@
           <w:numId w:val="16"/>
         </w:numPr>
       </w:pPr>
-      <w:bookmarkStart w:id="71" w:name="_Toc3475022"/>
-      <w:bookmarkStart w:id="72" w:name="_Toc202967935"/>
-      <w:r>
-        <w:t>Unternehmensgegenstand</w:t>
-      </w:r>
-      <w:bookmarkEnd w:id="71"/>
-      <w:bookmarkEnd w:id="72"/>
+      <w:r>
+        <w:t>Persönliche Verhältnisse und Unternehmensgegenstand</w:t>
+      </w:r>
     </w:p>
     <w:p>
       <w:pPr>
@@ -10195,6 +9603,7 @@
         <w:rPr>
           <w:highlight w:val="yellow"/>
         </w:rPr>
+        <w:t>[[SLOT_037: Persönliche Verhältnisse des Schuldners und Unternehmensgegenstand - Biographie, Geschäftstätigkeit, Entwicklung des Unternehmens]]</w:t>
       </w:r>
     </w:p>
     <w:p/>
@@ -10234,6 +9643,7 @@
         <w:rPr>
           <w:highlight w:val="yellow"/>
         </w:rPr>
+        <w:t>[[SLOT_038: Finanzierungsstruktur - Bankverbindungen, Kreditlinien, Darlehen mit Konditionen und Sicherheiten pro Bank]]</w:t>
       </w:r>
     </w:p>
     <w:p/>
@@ -10292,121 +9702,13 @@
           <w:lang w:eastAsia="de-DE"/>
         </w:rPr>
       </w:pPr>
-      <w:bookmarkStart w:id="77" w:name="KI_Schuldner_Der_Die_Groß"/>
-      <w:proofErr w:type="spellStart"/>
       <w:r>
         <w:rPr>
           <w:rFonts w:eastAsia="Times New Roman" w:cs="Calibri"/>
           <w:color w:val="000000"/>
           <w:lang w:eastAsia="de-DE"/>
         </w:rPr>
-        <w:t>KI_Schuldner_Der_Die_Groß KI_Schuldner_Schuldnerin beschäftigt [[SLOT_097: Anzahl Arbeitnehmer]] Arbeitnehmer, davon [[SLOT_098: Anzahl Auszubildende]] im Ausbildungsverhältnis. Ein Betriebsrat besteht (nicht). Lohnrückstände sind [[SLOT_099: Betrag/Status Lohnrückstände]] aufgelaufen. KI_Verwalter_Der_Die_Groß KI_Verwalter_Unterzeichner hat die Nettolohnzahlungen für [[SLOT_100: Monate Insolvenzgeldvorfinanzierung]] im Rahmen einer durch die Bundesagentur für Arbeit genehmigten Insolvenzgeldvorfinanzierung sichergestellt. In einer Betriebsversammlung am [[SLOT_101: Datum Betriebsversammlung]] wurden die Mitarbeiter über das Insolvenzverfahren und die Insolvenzgeldvorfinanzierung informiert.</w:t>
-      </w:r>
-      <w:bookmarkEnd w:id="77"/>
-      <w:proofErr w:type="spellEnd"/>
-      <w:r>
-        <w:rPr>
-          <w:rFonts w:eastAsia="Times New Roman" w:cs="Calibri"/>
-          <w:color w:val="000000"/>
-          <w:lang w:eastAsia="de-DE"/>
-        </w:rPr>
-      </w:r>
-      <w:bookmarkStart w:id="78" w:name="KI_Schuldner_Schuldnerin"/>
-      <w:proofErr w:type="spellStart"/>
-      <w:r>
-        <w:rPr>
-          <w:rFonts w:eastAsia="Times New Roman" w:cs="Calibri"/>
-          <w:color w:val="000000"/>
-          <w:lang w:eastAsia="de-DE"/>
-        </w:rPr>
-      </w:r>
-      <w:bookmarkEnd w:id="78"/>
-      <w:proofErr w:type="spellEnd"/>
-      <w:r>
-        <w:rPr>
-          <w:rFonts w:eastAsia="Times New Roman" w:cs="Calibri"/>
-          <w:color w:val="000000"/>
-          <w:lang w:eastAsia="de-DE"/>
-        </w:rPr>
-      </w:r>
-      <w:r>
-        <w:rPr>
-          <w:rFonts w:eastAsia="Times New Roman" w:cs="Calibri"/>
-          <w:color w:val="000000"/>
-          <w:lang w:eastAsia="de-DE"/>
-        </w:rPr>
-      </w:r>
-      <w:r>
-        <w:rPr>
-          <w:rFonts w:eastAsia="Times New Roman" w:cs="Calibri"/>
-          <w:color w:val="000000"/>
-          <w:highlight w:val="yellow"/>
-          <w:lang w:eastAsia="de-DE"/>
-        </w:rPr>
-      </w:r>
-      <w:r>
-        <w:rPr>
-          <w:rFonts w:eastAsia="Times New Roman" w:cs="Calibri"/>
-          <w:color w:val="000000"/>
-          <w:lang w:eastAsia="de-DE"/>
-        </w:rPr>
-      </w:r>
-      <w:r>
-        <w:rPr>
-          <w:rFonts w:eastAsia="Times New Roman" w:cs="Calibri"/>
-          <w:color w:val="000000"/>
-          <w:lang w:eastAsia="de-DE"/>
-        </w:rPr>
-      </w:r>
-      <w:bookmarkStart w:id="79" w:name="KI_Verwalter_Der_Die_Groß_003"/>
-      <w:proofErr w:type="spellStart"/>
-      <w:r>
-        <w:rPr>
-          <w:rFonts w:eastAsia="Times New Roman" w:cs="Calibri"/>
-          <w:color w:val="000000"/>
-          <w:lang w:eastAsia="de-DE"/>
-        </w:rPr>
-      </w:r>
-      <w:bookmarkEnd w:id="79"/>
-      <w:proofErr w:type="spellEnd"/>
-      <w:r>
-        <w:rPr>
-          <w:rFonts w:eastAsia="Times New Roman" w:cs="Calibri"/>
-          <w:color w:val="000000"/>
-          <w:lang w:eastAsia="de-DE"/>
-        </w:rPr>
-      </w:r>
-      <w:bookmarkStart w:id="80" w:name="KI_Verwalter_Unterzeichner_012"/>
-      <w:proofErr w:type="spellStart"/>
-      <w:r>
-        <w:rPr>
-          <w:rFonts w:eastAsia="Times New Roman" w:cs="Calibri"/>
-          <w:color w:val="000000"/>
-          <w:lang w:eastAsia="de-DE"/>
-        </w:rPr>
-      </w:r>
-      <w:bookmarkEnd w:id="80"/>
-      <w:proofErr w:type="spellEnd"/>
-      <w:r>
-        <w:rPr>
-          <w:rFonts w:eastAsia="Times New Roman" w:cs="Calibri"/>
-          <w:color w:val="000000"/>
-          <w:lang w:eastAsia="de-DE"/>
-        </w:rPr>
-      </w:r>
-      <w:r>
-        <w:rPr>
-          <w:rFonts w:eastAsia="Times New Roman" w:cs="Calibri"/>
-          <w:color w:val="000000"/>
-          <w:lang w:eastAsia="de-DE"/>
-        </w:rPr>
-      </w:r>
-      <w:r>
-        <w:rPr>
-          <w:rFonts w:eastAsia="Times New Roman" w:cs="Calibri"/>
-          <w:color w:val="000000"/>
-          <w:lang w:eastAsia="de-DE"/>
-        </w:rPr>
+        <w:t>[[SLOT_039: Arbeitsrechtliche Verhältnisse - Anzahl Arbeitnehmer, Auszubildende, Betriebsrat, Kündigungen, Sozialplan]]</w:t>
       </w:r>
     </w:p>
     <w:p>
@@ -10422,7 +9724,7 @@
         <w:rPr>
           <w:highlight w:val="yellow"/>
         </w:rPr>
-        <w:t>[[SLOT_102: kollektivarbeitsrechtliche und betriebsverfassungsrechtliche]]</w:t>
+        <w:t/>
       </w:r>
     </w:p>
     <w:p/>
@@ -10473,6 +9775,7 @@
         <w:rPr>
           <w:highlight w:val="yellow"/>
         </w:rPr>
+        <w:t>[[SLOT_040: Gewerberaummietverträge / Pachtverträge - Objekt, Vermieter, Miete, Laufzeit, Kündigungsstatus]]</w:t>
       </w:r>
     </w:p>
     <w:p/>
@@ -10505,6 +9808,7 @@
         <w:rPr>
           <w:highlight w:val="yellow"/>
         </w:rPr>
+        <w:t>[[SLOT_041: Versicherungsverträge - Art, Versicherer, Beiträge, Status]]</w:t>
       </w:r>
     </w:p>
     <w:p/>
@@ -10537,6 +9841,7 @@
         <w:rPr>
           <w:highlight w:val="yellow"/>
         </w:rPr>
+        <w:t>[[SLOT_042: Versorgungsverträge - Strom, Gas, Wasser, Telekommunikation]]</w:t>
       </w:r>
     </w:p>
     <w:p/>
@@ -10577,6 +9882,7 @@
         <w:rPr>
           <w:highlight w:val="yellow"/>
         </w:rPr>
+        <w:t>[[SLOT_043: Leasingverträge / Mietverträge über bewegliche Gegenstände]]</w:t>
       </w:r>
     </w:p>
     <w:p/>
@@ -10603,6 +9909,7 @@
         <w:rPr>
           <w:highlight w:val="yellow"/>
         </w:rPr>
+        <w:t>[[SLOT_044: Factoring-Vereinbarungen oder 'Factoring-Vereinbarungen bestehen nicht.']]</w:t>
       </w:r>
     </w:p>
     <w:p/>
@@ -10635,6 +9942,7 @@
         <w:rPr>
           <w:highlight w:val="yellow"/>
         </w:rPr>
+        <w:t>[[SLOT_045: Sonstige Verträge oder 'Sonstige wesentliche Vertragsverhältnisse sind nicht bekannt.']]</w:t>
       </w:r>
     </w:p>
     <w:p/>
@@ -10667,174 +9975,13 @@
           <w:lang w:eastAsia="de-DE"/>
         </w:rPr>
       </w:pPr>
-      <w:bookmarkStart w:id="93" w:name="KI_Schuldner_Der_Die_Groß_003"/>
-      <w:bookmarkStart w:id="94" w:name="_Hlk77953401"/>
-      <w:proofErr w:type="spellStart"/>
       <w:r>
         <w:rPr>
           <w:rFonts w:eastAsia="Times New Roman" w:cs="Calibri"/>
           <w:color w:val="000000"/>
           <w:lang w:eastAsia="de-DE"/>
         </w:rPr>
-      </w:r>
-      <w:bookmarkEnd w:id="93"/>
-      <w:proofErr w:type="spellEnd"/>
-      <w:r>
-        <w:rPr>
-          <w:rFonts w:eastAsia="Times New Roman" w:cs="Calibri"/>
-          <w:color w:val="000000"/>
-          <w:lang w:eastAsia="de-DE"/>
-        </w:rPr>
-      </w:r>
-      <w:bookmarkStart w:id="95" w:name="KI_Schuldner_Schuldnerin_002"/>
-      <w:proofErr w:type="spellStart"/>
-      <w:r>
-        <w:rPr>
-          <w:rFonts w:eastAsia="Times New Roman" w:cs="Calibri"/>
-          <w:color w:val="000000"/>
-          <w:lang w:eastAsia="de-DE"/>
-        </w:rPr>
-      </w:r>
-      <w:bookmarkEnd w:id="95"/>
-      <w:proofErr w:type="spellEnd"/>
-      <w:r>
-        <w:rPr>
-          <w:rFonts w:eastAsia="Times New Roman" w:cs="Calibri"/>
-          <w:color w:val="000000"/>
-          <w:lang w:eastAsia="de-DE"/>
-        </w:rPr>
-      </w:r>
-      <w:r>
-        <w:rPr>
-          <w:rFonts w:eastAsia="Times New Roman" w:cs="Calibri"/>
-          <w:color w:val="000000"/>
-          <w:lang w:eastAsia="de-DE"/>
-        </w:rPr>
-      </w:r>
-      <w:r>
-        <w:rPr>
-          <w:rFonts w:eastAsia="Times New Roman" w:cs="Calibri"/>
-          <w:color w:val="000000"/>
-          <w:highlight w:val="yellow"/>
-          <w:lang w:eastAsia="de-DE"/>
-        </w:rPr>
-      </w:r>
-      <w:r>
-        <w:rPr>
-          <w:rFonts w:eastAsia="Times New Roman" w:cs="Calibri"/>
-          <w:color w:val="000000"/>
-          <w:lang w:eastAsia="de-DE"/>
-        </w:rPr>
-      </w:r>
-      <w:r>
-        <w:rPr>
-          <w:rFonts w:eastAsia="Times New Roman" w:cs="Calibri"/>
-          <w:color w:val="000000"/>
-          <w:highlight w:val="yellow"/>
-          <w:lang w:eastAsia="de-DE"/>
-        </w:rPr>
-      </w:r>
-      <w:r>
-        <w:rPr>
-          <w:rFonts w:eastAsia="Times New Roman" w:cs="Calibri"/>
-          <w:color w:val="000000"/>
-          <w:lang w:eastAsia="de-DE"/>
-        </w:rPr>
-      </w:r>
-      <w:r>
-        <w:rPr>
-          <w:rFonts w:eastAsia="Times New Roman" w:cs="Calibri"/>
-          <w:color w:val="000000"/>
-          <w:highlight w:val="yellow"/>
-          <w:lang w:eastAsia="de-DE"/>
-        </w:rPr>
-      </w:r>
-      <w:r>
-        <w:rPr>
-          <w:rFonts w:eastAsia="Times New Roman" w:cs="Calibri"/>
-          <w:color w:val="000000"/>
-          <w:lang w:eastAsia="de-DE"/>
-        </w:rPr>
-      </w:r>
-      <w:r>
-        <w:rPr>
-          <w:rFonts w:eastAsia="Times New Roman" w:cs="Calibri"/>
-          <w:color w:val="000000"/>
-          <w:lang w:eastAsia="de-DE"/>
-        </w:rPr>
-      </w:r>
-      <w:bookmarkStart w:id="96" w:name="KI_Verwalter_Der_Die_Groß_004"/>
-      <w:proofErr w:type="spellStart"/>
-      <w:r>
-        <w:rPr>
-          <w:rFonts w:eastAsia="Times New Roman" w:cs="Calibri"/>
-          <w:color w:val="000000"/>
-          <w:lang w:eastAsia="de-DE"/>
-        </w:rPr>
-      </w:r>
-      <w:bookmarkEnd w:id="96"/>
-      <w:proofErr w:type="spellEnd"/>
-      <w:r>
-        <w:rPr>
-          <w:rFonts w:eastAsia="Times New Roman" w:cs="Calibri"/>
-          <w:color w:val="000000"/>
-          <w:lang w:eastAsia="de-DE"/>
-        </w:rPr>
-      </w:r>
-      <w:bookmarkStart w:id="97" w:name="KI_Verwalter_Unterzeichner_019"/>
-      <w:proofErr w:type="spellStart"/>
-      <w:r>
-        <w:rPr>
-          <w:rFonts w:eastAsia="Times New Roman" w:cs="Calibri"/>
-          <w:color w:val="000000"/>
-          <w:lang w:eastAsia="de-DE"/>
-        </w:rPr>
-      </w:r>
-      <w:bookmarkEnd w:id="97"/>
-      <w:proofErr w:type="spellEnd"/>
-      <w:r>
-        <w:rPr>
-          <w:rFonts w:eastAsia="Times New Roman" w:cs="Calibri"/>
-          <w:color w:val="000000"/>
-          <w:lang w:eastAsia="de-DE"/>
-        </w:rPr>
-      </w:r>
-      <w:r>
-        <w:rPr>
-          <w:rFonts w:eastAsia="Times New Roman" w:cs="Calibri"/>
-          <w:color w:val="000000"/>
-          <w:lang w:eastAsia="de-DE"/>
-        </w:rPr>
-      </w:r>
-      <w:r>
-        <w:rPr>
-          <w:rFonts w:eastAsia="Times New Roman" w:cs="Calibri"/>
-          <w:color w:val="000000"/>
-          <w:highlight w:val="yellow"/>
-          <w:lang w:eastAsia="de-DE"/>
-        </w:rPr>
-      </w:r>
-      <w:r>
-        <w:rPr>
-          <w:rFonts w:eastAsia="Times New Roman" w:cs="Calibri"/>
-          <w:color w:val="000000"/>
-          <w:lang w:eastAsia="de-DE"/>
-        </w:rPr>
-      </w:r>
-      <w:r>
-        <w:rPr>
-          <w:rFonts w:eastAsia="Times New Roman" w:cs="Calibri"/>
-          <w:color w:val="000000"/>
-          <w:highlight w:val="yellow"/>
-          <w:lang w:eastAsia="de-DE"/>
-        </w:rPr>
-      </w:r>
-      <w:r>
-        <w:rPr>
-          <w:rFonts w:eastAsia="Times New Roman" w:cs="Calibri"/>
-          <w:color w:val="000000"/>
-          <w:lang w:eastAsia="de-DE"/>
-        </w:rPr>
+        <w:t>[[SLOT_046: Erweiterte arbeitsrechtliche Verhältnisse bei größerem Betrieb - kollektivarbeitsrechtliche und betriebsverfassungsrechtliche Aspekte]]</w:t>
       </w:r>
     </w:p>
     <w:p>
@@ -10846,15 +9993,12 @@
       <w:pPr>
         <w:ind w:left="720"/>
       </w:pPr>
-      <w:bookmarkStart w:id="98" w:name="_Hlk94870808"/>
-      <w:r>
-        <w:rPr>
-          <w:highlight w:val="yellow"/>
-        </w:rPr>
-        <w:t>[[SLOT_110: kollektivarbeitsrechtliche und betriebsverfassungsrechtliche]]</w:t>
-      </w:r>
-      <w:bookmarkEnd w:id="94"/>
-      <w:bookmarkEnd w:id="98"/>
+      <w:r>
+        <w:rPr>
+          <w:highlight w:val="yellow"/>
+        </w:rPr>
+        <w:t/>
+      </w:r>
     </w:p>
     <w:p/>
     <w:p>
@@ -10876,47 +10020,8 @@
       <w:pPr>
         <w:ind w:left="709"/>
       </w:pPr>
-      <w:bookmarkStart w:id="100" w:name="_Hlk215046634"/>
-      <w:r>
-        <w:t>Im Zeitpunkt der Antragstellung verfügte</w:t>
-      </w:r>
-      <w:r>
-        <w:t xml:space="preserve"> </w:t>
-      </w:r>
-      <w:bookmarkStart w:id="101" w:name="KI_Schuldner_der_die"/>
-      <w:proofErr w:type="spellStart"/>
-      <w:r>
-        <w:t>KI_Schuldner_der_die</w:t>
-      </w:r>
-      <w:bookmarkEnd w:id="101"/>
-      <w:proofErr w:type="spellEnd"/>
-      <w:r>
-        <w:t xml:space="preserve"> </w:t>
-      </w:r>
-      <w:bookmarkStart w:id="102" w:name="KI_Schuldner_Schuldnerin_003"/>
-      <w:proofErr w:type="spellStart"/>
-      <w:r>
-        <w:t>KI_Schuldner_Schuldnerin</w:t>
-      </w:r>
-      <w:bookmarkEnd w:id="102"/>
-      <w:proofErr w:type="spellEnd"/>
-      <w:r>
-        <w:t xml:space="preserve"> </w:t>
-      </w:r>
-      <w:r>
-        <w:t xml:space="preserve">über die nachstehenden </w:t>
-      </w:r>
-      <w:r>
-        <w:t>Girok</w:t>
-      </w:r>
-      <w:r>
-        <w:t>onten</w:t>
-      </w:r>
-      <w:r>
-        <w:t>:</w:t>
-      </w:r>
-      <w:r>
-        <w:t xml:space="preserve"> </w:t>
+      <w:r>
+        <w:t>[[SLOT_047: Zahlungsverkehr - Kontenübersicht mit Kreditinstitut, Kontonummer, Saldo bei Antragstellung, Kontensperrung]]</w:t>
       </w:r>
     </w:p>
     <w:bookmarkEnd w:id="100"/>
@@ -10995,35 +10100,7 @@
                 <w:highlight w:val="yellow"/>
                 <w:u w:val="single"/>
               </w:rPr>
-              <w:t>[[SLOT_176: Kreditinstitut 1]]</w:t>
-            </w:r>
-          </w:p>
-          <w:p>
-            <w:pPr>
-              <w:ind w:left="34"/>
-            </w:pPr>
-            <w:r>
-              <w:t xml:space="preserve">Konto-Nr.: </w:t>
-            </w:r>
-            <w:r>
-              <w:rPr>
-                <w:highlight w:val="yellow"/>
-              </w:rPr>
-              <w:t>12345678</w:t>
-            </w:r>
-          </w:p>
-          <w:p>
-            <w:pPr>
-              <w:ind w:left="34"/>
-            </w:pPr>
-            <w:r>
-              <w:t xml:space="preserve">Konto-Nr.: </w:t>
-            </w:r>
-            <w:r>
-              <w:rPr>
-                <w:highlight w:val="yellow"/>
-              </w:rPr>
-              <w:t>87654321</w:t>
+              <w:t>[[SLOT_048: Kreditinstitut 1 mit Kontonummer]]</w:t>
             </w:r>
           </w:p>
         </w:tc>
@@ -11040,42 +10117,9 @@
                 <w:highlight w:val="yellow"/>
               </w:rPr>
             </w:pPr>
-          </w:p>
-          <w:p>
-            <w:pPr>
-              <w:ind w:left="34"/>
-              <w:jc w:val="right"/>
-              <w:cnfStyle w:val="000000100000" w:firstRow="0" w:lastRow="0" w:firstColumn="0" w:lastColumn="0" w:oddVBand="0" w:evenVBand="0" w:oddHBand="1" w:evenHBand="0" w:firstRowFirstColumn="0" w:firstRowLastColumn="0" w:lastRowFirstColumn="0" w:lastRowLastColumn="0"/>
-              <w:rPr>
-                <w:highlight w:val="yellow"/>
-              </w:rPr>
-            </w:pPr>
             <w:r>
-              <w:rPr>
-                <w:highlight w:val="yellow"/>
-              </w:rPr>
-              <w:t>[[SLOT_177: Tabellenwert]] EUR</w:t>
+              <w:t>[[SLOT_049: Saldo 1]] EUR</w:t>
             </w:r>
-            <w:r/>
-            <w:r/>
-          </w:p>
-          <w:p>
-            <w:pPr>
-              <w:ind w:left="34"/>
-              <w:jc w:val="right"/>
-              <w:cnfStyle w:val="000000100000" w:firstRow="0" w:lastRow="0" w:firstColumn="0" w:lastColumn="0" w:oddVBand="0" w:evenVBand="0" w:oddHBand="1" w:evenHBand="0" w:firstRowFirstColumn="0" w:firstRowLastColumn="0" w:lastRowFirstColumn="0" w:lastRowLastColumn="0"/>
-              <w:rPr>
-                <w:highlight w:val="yellow"/>
-              </w:rPr>
-            </w:pPr>
-            <w:r>
-              <w:rPr>
-                <w:highlight w:val="yellow"/>
-              </w:rPr>
-              <w:t>[[SLOT_179: Tabellenwert]] EUR</w:t>
-            </w:r>
-            <w:r/>
-            <w:r/>
           </w:p>
         </w:tc>
       </w:tr>
@@ -11098,35 +10142,7 @@
                 <w:highlight w:val="yellow"/>
                 <w:u w:val="single"/>
               </w:rPr>
-              <w:t>[[SLOT_181: Kreditinstitut 2]]</w:t>
-            </w:r>
-          </w:p>
-          <w:p>
-            <w:pPr>
-              <w:ind w:left="34"/>
-            </w:pPr>
-            <w:r>
-              <w:t xml:space="preserve">Konto-Nr.: </w:t>
-            </w:r>
-            <w:r>
-              <w:rPr>
-                <w:highlight w:val="yellow"/>
-              </w:rPr>
-              <w:t>23456789</w:t>
-            </w:r>
-          </w:p>
-          <w:p>
-            <w:pPr>
-              <w:ind w:left="34"/>
-            </w:pPr>
-            <w:r>
-              <w:t xml:space="preserve">Konto-Nr.: </w:t>
-            </w:r>
-            <w:r>
-              <w:rPr>
-                <w:highlight w:val="yellow"/>
-              </w:rPr>
-              <w:t>98765432</w:t>
+              <w:t>[[SLOT_050: Kreditinstitut 2 mit Kontonummer]]</w:t>
             </w:r>
           </w:p>
         </w:tc>
@@ -11143,42 +10159,9 @@
                 <w:highlight w:val="yellow"/>
               </w:rPr>
             </w:pPr>
-          </w:p>
-          <w:p>
-            <w:pPr>
-              <w:ind w:left="34"/>
-              <w:jc w:val="right"/>
-              <w:cnfStyle w:val="000000000000" w:firstRow="0" w:lastRow="0" w:firstColumn="0" w:lastColumn="0" w:oddVBand="0" w:evenVBand="0" w:oddHBand="0" w:evenHBand="0" w:firstRowFirstColumn="0" w:firstRowLastColumn="0" w:lastRowFirstColumn="0" w:lastRowLastColumn="0"/>
-              <w:rPr>
-                <w:highlight w:val="yellow"/>
-              </w:rPr>
-            </w:pPr>
             <w:r>
-              <w:rPr>
-                <w:highlight w:val="yellow"/>
-              </w:rPr>
-              <w:t>[[SLOT_182: Tabellenwert]] EUR</w:t>
+              <w:t>[[SLOT_051: Saldo 2]] EUR</w:t>
             </w:r>
-            <w:r/>
-            <w:r/>
-          </w:p>
-          <w:p>
-            <w:pPr>
-              <w:ind w:left="34"/>
-              <w:jc w:val="right"/>
-              <w:cnfStyle w:val="000000000000" w:firstRow="0" w:lastRow="0" w:firstColumn="0" w:lastColumn="0" w:oddVBand="0" w:evenVBand="0" w:oddHBand="0" w:evenHBand="0" w:firstRowFirstColumn="0" w:firstRowLastColumn="0" w:lastRowFirstColumn="0" w:lastRowLastColumn="0"/>
-              <w:rPr>
-                <w:highlight w:val="yellow"/>
-              </w:rPr>
-            </w:pPr>
-            <w:r>
-              <w:rPr>
-                <w:highlight w:val="yellow"/>
-              </w:rPr>
-              <w:t>[[SLOT_184: Tabellenwert]] EUR</w:t>
-            </w:r>
-            <w:r/>
-            <w:r/>
           </w:p>
         </w:tc>
       </w:tr>
@@ -11200,7 +10183,7 @@
               <w:rPr>
                 <w:highlight w:val="yellow"/>
               </w:rPr>
-              <w:t>[[SLOT_186: Tabellenwert]]</w:t>
+              <w:t>[[SLOT_052: Weitere Konten]]</w:t>
             </w:r>
           </w:p>
         </w:tc>
@@ -11222,17 +10205,15 @@
               <w:rPr>
                 <w:highlight w:val="yellow"/>
               </w:rPr>
-              <w:t>[[SLOT_188: Tabellenwert]] EUR</w:t>
+              <w:t>[[SLOT_053: Saldo weitere]] EUR</w:t>
             </w:r>
-            <w:r/>
-            <w:r/>
           </w:p>
         </w:tc>
       </w:tr>
     </w:tbl>
     <w:p>
       <w:r>
-        <w:tab/>
+        <w:t/>
       </w:r>
     </w:p>
     <w:p>
@@ -11246,11 +10227,7 @@
         <w:rPr>
           <w:highlight w:val="yellow"/>
         </w:rPr>
-      </w:r>
-      <w:r>
-        <w:rPr>
-          <w:highlight w:val="yellow"/>
-        </w:rPr>
+        <w:t/>
       </w:r>
     </w:p>
     <w:p>
@@ -11261,7 +10238,7 @@
         <w:ind w:left="426"/>
       </w:pPr>
       <w:r>
-        <w:tab/>
+        <w:t/>
       </w:r>
     </w:p>
     <w:p>
@@ -11272,28 +10249,7 @@
         <w:ind w:left="709"/>
       </w:pPr>
       <w:r>
-        <w:t xml:space="preserve">Die Konten wurden für Verfügungen </w:t>
-      </w:r>
-      <w:r>
-        <w:rPr>
-          <w:highlight w:val="yellow"/>
-        </w:rPr>
-        <w:t>KI_Schuldner_des_der KI_Schuldner_Schuldnerin</w:t>
-      </w:r>
-      <w:r>
-        <w:t xml:space="preserve"> gesperrt. Seit Anordnung der vorläufigen Verwaltung werden Zahlungseingänge auf </w:t>
-      </w:r>
-      <w:r>
-        <w:t>das</w:t>
-      </w:r>
-      <w:r>
-        <w:t xml:space="preserve"> </w:t>
-      </w:r>
-      <w:r>
-        <w:t>Insolvenzsonder</w:t>
-      </w:r>
-      <w:r>
-        <w:t>konto weitergeleitet.</w:t>
+        <w:t/>
       </w:r>
     </w:p>
     <w:p/>
@@ -11344,17 +10300,8 @@
         <w:ind w:left="709"/>
         <w:textAlignment w:val="auto"/>
       </w:pPr>
-      <w:r/>
-      <w:r>
-        <w:rPr>
-          <w:highlight w:val="yellow"/>
-        </w:rPr>
-      </w:r>
-      <w:r/>
-      <w:r>
-        <w:rPr>
-          <w:highlight w:val="yellow"/>
-        </w:rPr>
+      <w:r>
+        <w:t>[[SLOT_054: Buchhaltung vor Antragstellung - wer hat geführt, Qualität, Vollständigkeit]]</w:t>
       </w:r>
     </w:p>
     <w:p>
@@ -11372,7 +10319,7 @@
         <w:rPr>
           <w:highlight w:val="yellow"/>
         </w:rPr>
-        <w:t>KI_Verwalter_Der_Die_Groß KI_Verwalter_Unterzeichner führte auch die Lohnbuchhaltung KI_Schuldner_des_der KI_Schuldner_Schuldnerin.</w:t>
+        <w:t/>
       </w:r>
     </w:p>
     <w:p/>
@@ -11400,21 +10347,9 @@
       <w:pPr>
         <w:ind w:left="709"/>
       </w:pPr>
-      <w:bookmarkStart w:id="109" w:name="_Hlk77953591"/>
-      <w:r/>
-      <w:r/>
-      <w:r/>
-      <w:r/>
-      <w:r>
-        <w:rPr>
-          <w:highlight w:val="yellow"/>
-        </w:rPr>
-      </w:r>
-      <w:r/>
-      <w:r/>
-      <w:r/>
-      <w:bookmarkEnd w:id="109"/>
-      <w:r/>
+      <w:r>
+        <w:t>[[SLOT_055: Buchhaltung nach Antragstellung - Fortführung durch wen, Maßnahmen]]</w:t>
+      </w:r>
     </w:p>
     <w:p>
       <w:pPr>
@@ -11448,6 +10383,7 @@
         <w:rPr>
           <w:highlight w:val="yellow"/>
         </w:rPr>
+        <w:t>[[SLOT_056: Anhängige Rechtsstreitigkeiten oder 'Anhängige Rechtsstreitigkeiten sind dem Unterzeichner nicht bekannt.']]</w:t>
       </w:r>
     </w:p>
     <w:p/>
@@ -11502,11 +10438,7 @@
         <w:rPr>
           <w:highlight w:val="yellow"/>
         </w:rPr>
-      </w:r>
-      <w:r>
-        <w:rPr>
-          <w:highlight w:val="yellow"/>
-        </w:rPr>
+        <w:t>[[SLOT_057: Wirtschaftliche Entwicklung und Krisenursache - ausführliche Darstellung der Unternehmensentwicklung, Umsatzentwicklung, Krisenursachen, ggf. mit Jahresabschlusszahlen]]</w:t>
       </w:r>
     </w:p>
     <w:p/>
@@ -11555,6 +10487,7 @@
         <w:rPr>
           <w:highlight w:val="yellow"/>
         </w:rPr>
+        <w:t>[[SLOT_058: Vermögenssicherung - Maßnahmen zur Sicherung des Schuldnervermögens]]</w:t>
       </w:r>
     </w:p>
     <w:p/>
@@ -11594,143 +10527,37 @@
           <w:highlight w:val="yellow"/>
           <w:lang w:eastAsia="de-DE"/>
         </w:rPr>
-      </w:r>
-      <w:r>
+        <w:t>[[SLOT_059: Sicherung der Betriebsfortführung - Betriebsfortführung ja/nein, Maßnahmen, Personal, Aufträge, Lieferanten]]</w:t>
+      </w:r>
+    </w:p>
+    <w:p>
+      <w:pPr>
+        <w:ind w:left="709"/>
         <w:rPr>
           <w:lang w:eastAsia="de-DE"/>
         </w:rPr>
-      </w:r>
-      <w:r>
-        <w:rPr>
-          <w:highlight w:val="yellow"/>
-          <w:lang w:eastAsia="de-DE"/>
-        </w:rPr>
-      </w:r>
-      <w:r>
-        <w:rPr>
-          <w:lang w:eastAsia="de-DE"/>
-        </w:rPr>
-      </w:r>
-      <w:r>
-        <w:rPr>
-          <w:highlight w:val="yellow"/>
-          <w:lang w:eastAsia="de-DE"/>
-        </w:rPr>
-      </w:r>
-      <w:r>
-        <w:rPr>
-          <w:lang w:eastAsia="de-DE"/>
-        </w:rPr>
-      </w:r>
-      <w:r>
-        <w:rPr>
-          <w:lang w:eastAsia="de-DE"/>
-        </w:rPr>
-      </w:r>
-      <w:bookmarkStart w:id="115" w:name="KI_Verwalter_der_die_003"/>
-      <w:proofErr w:type="spellStart"/>
-      <w:r>
-        <w:rPr>
-          <w:lang w:eastAsia="de-DE"/>
-        </w:rPr>
-      </w:r>
-      <w:bookmarkEnd w:id="115"/>
-      <w:proofErr w:type="spellEnd"/>
-      <w:r>
-        <w:rPr>
-          <w:lang w:eastAsia="de-DE"/>
-        </w:rPr>
-      </w:r>
-      <w:bookmarkStart w:id="116" w:name="KI_Verwalter_Unterzeichner_014"/>
-      <w:proofErr w:type="spellStart"/>
-      <w:r>
-        <w:rPr>
-          <w:lang w:eastAsia="de-DE"/>
-        </w:rPr>
-      </w:r>
-      <w:bookmarkEnd w:id="116"/>
-      <w:proofErr w:type="spellEnd"/>
-      <w:r>
-        <w:rPr>
-          <w:lang w:eastAsia="de-DE"/>
-        </w:rPr>
-      </w:r>
-      <w:r>
-        <w:rPr>
-          <w:lang w:eastAsia="de-DE"/>
-        </w:rPr>
-      </w:r>
-      <w:r>
-        <w:rPr>
-          <w:lang w:eastAsia="de-DE"/>
-        </w:rPr>
-      </w:r>
-      <w:r>
-        <w:rPr>
-          <w:lang w:eastAsia="de-DE"/>
-        </w:rPr>
-      </w:r>
-      <w:bookmarkStart w:id="117" w:name="KI_Verwalter_der_die_004"/>
-      <w:proofErr w:type="spellStart"/>
-      <w:r>
-        <w:rPr>
-          <w:lang w:eastAsia="de-DE"/>
-        </w:rPr>
-      </w:r>
-      <w:bookmarkEnd w:id="117"/>
-      <w:proofErr w:type="spellEnd"/>
-      <w:r>
-        <w:rPr>
-          <w:lang w:eastAsia="de-DE"/>
-        </w:rPr>
-      </w:r>
-      <w:r>
-        <w:rPr>
-          <w:highlight w:val="yellow"/>
-          <w:lang w:eastAsia="de-DE"/>
-        </w:rPr>
-      </w:r>
-      <w:r>
-        <w:rPr>
-          <w:highlight w:val="yellow"/>
-          <w:lang w:eastAsia="de-DE"/>
-        </w:rPr>
-      </w:r>
-      <w:r>
-        <w:rPr>
-          <w:lang w:eastAsia="de-DE"/>
-        </w:rPr>
-      </w:r>
+      </w:pPr>
     </w:p>
     <w:p>
       <w:pPr>
         <w:ind w:left="709"/>
-        <w:rPr>
-          <w:lang w:eastAsia="de-DE"/>
-        </w:rPr>
-      </w:pPr>
-    </w:p>
-    <w:p>
-      <w:pPr>
-        <w:ind w:left="709"/>
-      </w:pPr>
-      <w:bookmarkStart w:id="118" w:name="_Hlk206083607"/>
+      </w:pPr>
       <w:r>
         <w:rPr>
           <w:b/>
           <w:bCs/>
           <w:highlight w:val="yellow"/>
         </w:rPr>
-      </w:r>
-      <w:r/>
-      <w:r/>
-      <w:r/>
-      <w:r/>
+        <w:t/>
+      </w:r>
     </w:p>
     <w:p>
       <w:pPr>
         <w:ind w:left="709"/>
       </w:pPr>
+      <w:r>
+        <w:t/>
+      </w:r>
     </w:p>
     <w:p>
       <w:pPr>
@@ -11742,29 +10569,16 @@
           <w:bCs/>
           <w:highlight w:val="yellow"/>
         </w:rPr>
-      </w:r>
-      <w:r/>
-      <w:r/>
-      <w:r>
-        <w:rPr>
-          <w:highlight w:val="yellow"/>
-        </w:rPr>
-      </w:r>
-      <w:r/>
-      <w:r>
-        <w:rPr>
-          <w:highlight w:val="yellow"/>
-        </w:rPr>
-      </w:r>
-      <w:r/>
-      <w:r/>
-      <w:r/>
-      <w:r/>
+        <w:t/>
+      </w:r>
     </w:p>
     <w:p>
       <w:pPr>
         <w:ind w:left="709"/>
       </w:pPr>
+      <w:r>
+        <w:t/>
+      </w:r>
     </w:p>
     <w:p>
       <w:pPr>
@@ -11776,31 +10590,16 @@
           <w:bCs/>
           <w:highlight w:val="yellow"/>
         </w:rPr>
-      </w:r>
-      <w:r/>
-      <w:r/>
-      <w:r/>
-      <w:r/>
-      <w:r>
-        <w:rPr>
-          <w:highlight w:val="yellow"/>
-        </w:rPr>
-      </w:r>
-      <w:r>
-        <w:rPr>
-          <w:highlight w:val="yellow"/>
-        </w:rPr>
-      </w:r>
-      <w:r>
-        <w:rPr>
-          <w:highlight w:val="yellow"/>
-        </w:rPr>
+        <w:t/>
       </w:r>
     </w:p>
     <w:p>
       <w:pPr>
         <w:ind w:left="709"/>
       </w:pPr>
+      <w:r>
+        <w:t/>
+      </w:r>
     </w:p>
     <w:p>
       <w:pPr>
@@ -11812,14 +10611,8 @@
           <w:bCs/>
           <w:highlight w:val="yellow"/>
         </w:rPr>
-      </w:r>
-      <w:r/>
-      <w:r/>
-      <w:r/>
-      <w:r/>
-      <w:r/>
-      <w:r/>
-      <w:r/>
+        <w:t/>
+      </w:r>
     </w:p>
     <w:bookmarkEnd w:id="118"/>
     <w:p>
@@ -11828,6 +10621,9 @@
           <w:lang w:eastAsia="de-DE"/>
         </w:rPr>
       </w:pPr>
+      <w:r>
+        <w:t/>
+      </w:r>
     </w:p>
     <w:p>
       <w:pPr>
@@ -11852,6 +10648,9 @@
       <w:pPr>
         <w:ind w:left="709"/>
       </w:pPr>
+      <w:r>
+        <w:t/>
+      </w:r>
     </w:p>
     <w:p>
       <w:pPr>
@@ -11862,82 +10661,48 @@
           <w:lang w:eastAsia="de-DE"/>
         </w:rPr>
       </w:pPr>
-      <w:bookmarkStart w:id="119" w:name="KI_Verwalter_Der_Die_Groß_005"/>
-      <w:proofErr w:type="spellStart"/>
       <w:r>
         <w:rPr>
           <w:rFonts w:eastAsia="Times New Roman" w:cs="Calibri"/>
           <w:color w:val="000000"/>
           <w:lang w:eastAsia="de-DE"/>
         </w:rPr>
-        <w:t>KI_Verwalter_Der_Die_Groß</w:t>
-      </w:r>
-      <w:bookmarkEnd w:id="119"/>
-      <w:proofErr w:type="spellEnd"/>
-      <w:r>
+        <w:t>[[SLOT_060: Datensicherung - Umfang, Medium, Aufbewahrung]]</w:t>
+      </w:r>
+    </w:p>
+    <w:p>
+      <w:pPr>
+        <w:ind w:left="709"/>
+      </w:pPr>
+      <w:r>
+        <w:t/>
+      </w:r>
+    </w:p>
+    <w:p>
+      <w:pPr>
+        <w:ind w:left="709"/>
         <w:rPr>
           <w:rFonts w:eastAsia="Times New Roman" w:cs="Calibri"/>
           <w:color w:val="000000"/>
           <w:lang w:eastAsia="de-DE"/>
         </w:rPr>
-        <w:t xml:space="preserve"> </w:t>
-      </w:r>
-      <w:bookmarkStart w:id="120" w:name="KI_Verwalter_Unterzeichner_015"/>
-      <w:proofErr w:type="spellStart"/>
+      </w:pPr>
       <w:r>
         <w:rPr>
           <w:rFonts w:eastAsia="Times New Roman" w:cs="Calibri"/>
           <w:color w:val="000000"/>
           <w:lang w:eastAsia="de-DE"/>
         </w:rPr>
-        <w:t>KI_Verwalter_Unterzeichner</w:t>
-      </w:r>
-      <w:bookmarkEnd w:id="120"/>
-      <w:proofErr w:type="spellEnd"/>
-      <w:r>
-        <w:rPr>
-          <w:rFonts w:eastAsia="Times New Roman" w:cs="Calibri"/>
-          <w:color w:val="000000"/>
-          <w:lang w:eastAsia="de-DE"/>
-        </w:rPr>
-        <w:t xml:space="preserve"> </w:t>
-      </w:r>
-      <w:r>
-        <w:rPr>
-          <w:rFonts w:eastAsia="Times New Roman" w:cs="Calibri"/>
-          <w:color w:val="000000"/>
-          <w:lang w:eastAsia="de-DE"/>
-        </w:rPr>
-        <w:t xml:space="preserve">führte selbst eine Datensicherung im schuldnerischen Unternehmen durch. Hierbei handelt es sich um eine Sicherheitskopie von Dateien auf externe Festplatten, auf die zurückgegriffen werden kann, wenn die ursprünglichen Dateien verloren gehen oder zerstört werden. </w:t>
+        <w:t/>
       </w:r>
     </w:p>
     <w:p>
       <w:pPr>
         <w:ind w:left="709"/>
       </w:pPr>
-    </w:p>
-    <w:p>
-      <w:pPr>
-        <w:ind w:left="709"/>
-        <w:rPr>
-          <w:rFonts w:eastAsia="Times New Roman" w:cs="Calibri"/>
-          <w:color w:val="000000"/>
-          <w:lang w:eastAsia="de-DE"/>
-        </w:rPr>
-      </w:pPr>
-      <w:r>
-        <w:rPr>
-          <w:rFonts w:eastAsia="Times New Roman" w:cs="Calibri"/>
-          <w:color w:val="000000"/>
-          <w:lang w:eastAsia="de-DE"/>
-        </w:rPr>
-        <w:t xml:space="preserve">Bei den sichergestellten Daten handelt es sich um den digitalen Datenbestand des Unternehmens. Die durchgeführte Datensicherung erforderte ein ganzheitliches Datenmanagement, beginnend mit der Erstellung der Sicherung, über die inhaltliche Überprüfung, bis hin zu einer langfristig geschützten Archivierung der Daten. </w:t>
-      </w:r>
-    </w:p>
-    <w:p>
-      <w:pPr>
-        <w:ind w:left="709"/>
-      </w:pPr>
+      <w:r>
+        <w:t/>
+      </w:r>
     </w:p>
     <w:p>
       <w:pPr>
@@ -11958,36 +10723,27 @@
           <w:highlight w:val="yellow"/>
           <w:lang w:eastAsia="de-DE"/>
         </w:rPr>
-        <w:t>optional:</w:t>
-      </w:r>
-      <w:r>
+        <w:t/>
+      </w:r>
+    </w:p>
+    <w:p>
+      <w:pPr>
+        <w:ind w:left="709"/>
         <w:rPr>
           <w:rFonts w:eastAsia="Times New Roman" w:cs="Calibri"/>
           <w:color w:val="000000"/>
           <w:highlight w:val="yellow"/>
           <w:lang w:eastAsia="de-DE"/>
         </w:rPr>
-        <w:t xml:space="preserve"> bei zusätzlicher Belastung (Rücksprache mit MM zu Arbeitsaufwand und Umfang - Aktenvermerk MM):</w:t>
-      </w:r>
-    </w:p>
-    <w:p>
-      <w:pPr>
-        <w:ind w:left="709"/>
+      </w:pPr>
+      <w:r>
         <w:rPr>
           <w:rFonts w:eastAsia="Times New Roman" w:cs="Calibri"/>
           <w:color w:val="000000"/>
           <w:highlight w:val="yellow"/>
           <w:lang w:eastAsia="de-DE"/>
         </w:rPr>
-      </w:pPr>
-      <w:r>
-        <w:rPr>
-          <w:rFonts w:eastAsia="Times New Roman" w:cs="Calibri"/>
-          <w:color w:val="000000"/>
-          <w:highlight w:val="yellow"/>
-          <w:lang w:eastAsia="de-DE"/>
-        </w:rPr>
-        <w:t xml:space="preserve">- Datensicherung in komplexen EDV-Systemen; </w:t>
+        <w:t/>
       </w:r>
     </w:p>
     <w:p>
@@ -12009,16 +10765,7 @@
           <w:highlight w:val="yellow"/>
           <w:lang w:eastAsia="de-DE"/>
         </w:rPr>
-        <w:t xml:space="preserve">- </w:t>
-      </w:r>
-      <w:r>
-        <w:rPr>
-          <w:rFonts w:eastAsia="Times New Roman" w:cs="Calibri"/>
-          <w:color w:val="000000"/>
-          <w:highlight w:val="yellow"/>
-          <w:lang w:eastAsia="de-DE"/>
-        </w:rPr>
-        <w:t xml:space="preserve">Datenaufbereitung aus branchenspezifischer Software (Umwandlung zum lesbar machen); </w:t>
+        <w:t/>
       </w:r>
     </w:p>
     <w:p>
@@ -12037,7 +10784,7 @@
           <w:highlight w:val="yellow"/>
           <w:lang w:eastAsia="de-DE"/>
         </w:rPr>
-        <w:t>- Datenwiederherstellung (gelöschte Daten wiederherstellen)</w:t>
+        <w:t/>
       </w:r>
     </w:p>
     <w:p/>
@@ -12066,6 +10813,7 @@
         <w:rPr>
           <w:highlight w:val="yellow"/>
         </w:rPr>
+        <w:t>[[SLOT_061: Sanierungsaussichten - Analyse der Sanierungsfähigkeit, ggf. Fortführungsprognose, ggf. Verwertungskonzept]]</w:t>
       </w:r>
     </w:p>
     <w:p/>
@@ -12144,110 +10892,7 @@
         <w:ind w:left="709"/>
       </w:pPr>
       <w:r>
-        <w:t xml:space="preserve">Die Bewertung und Inventarisierung des beweglichen Sachanlagevermögens wurden am </w:t>
-      </w:r>
-      <w:proofErr w:type="spellStart"/>
-      <w:r>
-        <w:rPr>
-          <w:highlight w:val="yellow"/>
-        </w:rPr>
-        <w:t>xxxx</w:t>
-      </w:r>
-      <w:proofErr w:type="spellEnd"/>
-      <w:r>
-        <w:t xml:space="preserve"> in Auftrag gegeben. Die Aufnahme erfolgte im Zeitraum zwischen dem </w:t>
-      </w:r>
-      <w:proofErr w:type="spellStart"/>
-      <w:r>
-        <w:rPr>
-          <w:highlight w:val="yellow"/>
-        </w:rPr>
-        <w:t>xxxx</w:t>
-      </w:r>
-      <w:proofErr w:type="spellEnd"/>
-      <w:r>
-        <w:rPr>
-          <w:highlight w:val="yellow"/>
-        </w:rPr>
-        <w:t xml:space="preserve"> und </w:t>
-      </w:r>
-      <w:proofErr w:type="spellStart"/>
-      <w:r>
-        <w:rPr>
-          <w:highlight w:val="yellow"/>
-        </w:rPr>
-        <w:t>xxxx</w:t>
-      </w:r>
-      <w:proofErr w:type="spellEnd"/>
-      <w:r>
-        <w:t xml:space="preserve"> durch den Sachverständigen </w:t>
-      </w:r>
-      <w:proofErr w:type="spellStart"/>
-      <w:r>
-        <w:rPr>
-          <w:highlight w:val="yellow"/>
-        </w:rPr>
-        <w:t>xxxxxx</w:t>
-      </w:r>
-      <w:proofErr w:type="spellEnd"/>
-      <w:r>
-        <w:t>. Inhaltlich nimmt</w:t>
-      </w:r>
-      <w:r>
-        <w:t xml:space="preserve"> </w:t>
-      </w:r>
-      <w:bookmarkStart w:id="126" w:name="KI_Verwalter_der_die_005"/>
-      <w:proofErr w:type="spellStart"/>
-      <w:r>
-        <w:t>KI_Verwalter_der_die</w:t>
-      </w:r>
-      <w:bookmarkEnd w:id="126"/>
-      <w:proofErr w:type="spellEnd"/>
-      <w:r>
-        <w:t xml:space="preserve"> </w:t>
-      </w:r>
-      <w:bookmarkStart w:id="127" w:name="KI_Verwalter_Unterzeichner_016"/>
-      <w:proofErr w:type="spellStart"/>
-      <w:r>
-        <w:t>KI_Verwalter_Unterzeichner</w:t>
-      </w:r>
-      <w:bookmarkEnd w:id="127"/>
-      <w:proofErr w:type="spellEnd"/>
-      <w:r>
-        <w:t xml:space="preserve"> </w:t>
-      </w:r>
-      <w:r>
-        <w:t xml:space="preserve">insoweit Bezug auf das als </w:t>
-      </w:r>
-      <w:r>
-        <w:rPr>
-          <w:u w:val="single"/>
-        </w:rPr>
-        <w:t xml:space="preserve">Anlage </w:t>
-      </w:r>
-      <w:r>
-        <w:rPr>
-          <w:highlight w:val="yellow"/>
-          <w:u w:val="single"/>
-        </w:rPr>
-        <w:t>xx</w:t>
-      </w:r>
-      <w:r>
-        <w:t xml:space="preserve"> beigefügte Gutachten vom </w:t>
-      </w:r>
-      <w:proofErr w:type="spellStart"/>
-      <w:r>
-        <w:rPr>
-          <w:highlight w:val="yellow"/>
-        </w:rPr>
-        <w:t>xxxxx</w:t>
-      </w:r>
-      <w:proofErr w:type="spellEnd"/>
-      <w:r>
-        <w:rPr>
-          <w:highlight w:val="yellow"/>
-        </w:rPr>
-        <w:t>.</w:t>
+        <w:t>KI_Verwalter_Der_Die_Groß Unterzeichner hat die Bewertung und Inventarisierung des beweglichen Sachanlagevermögens in Auftrag gegeben.</w:t>
       </w:r>
     </w:p>
     <w:p>
@@ -12259,47 +10904,15 @@
       <w:pPr>
         <w:ind w:left="709"/>
       </w:pPr>
-      <w:bookmarkStart w:id="128" w:name="_Hlk77953711"/>
-      <w:r/>
-      <w:r/>
-      <w:bookmarkStart w:id="129" w:name="KI_Verwalter_der_die_006"/>
-      <w:proofErr w:type="spellStart"/>
-      <w:r/>
-      <w:bookmarkEnd w:id="129"/>
-      <w:proofErr w:type="spellEnd"/>
-      <w:r/>
-      <w:bookmarkStart w:id="130" w:name="KI_Verwalter_Unterzeichner_017"/>
-      <w:proofErr w:type="spellStart"/>
-      <w:r/>
-      <w:bookmarkEnd w:id="130"/>
-      <w:proofErr w:type="spellEnd"/>
-      <w:r/>
-      <w:r/>
-      <w:r>
-        <w:rPr>
-          <w:highlight w:val="yellow"/>
-        </w:rPr>
-      </w:r>
-      <w:r/>
-      <w:r>
-        <w:rPr>
-          <w:highlight w:val="yellow"/>
-        </w:rPr>
-      </w:r>
-      <w:r/>
-      <w:r>
-        <w:rPr>
-          <w:u w:val="single"/>
-        </w:rPr>
-      </w:r>
-      <w:r>
-        <w:rPr>
-          <w:highlight w:val="yellow"/>
-          <w:u w:val="single"/>
-        </w:rPr>
-      </w:r>
-      <w:r/>
-      <w:bookmarkEnd w:id="128"/>
+      <w:r>
+        <w:t>Die Aufnahme erfolgte zum Bewertungsstichtag des [[SLOT_062: Bewertungsstichtag]] durch den Sachverständigen [[SLOT_063: Sachverständiger Name und Adresse]].</w:t>
+      </w:r>
+    </w:p>
+    <w:p/>
+    <w:p>
+      <w:r>
+        <w:t>Inhaltlich nimmt KI_Verwalter_der_die Unterzeichner insoweit Bezug auf das als Anlage II beigefügte Gutachten vom [[SLOT_064: Datum Wertgutachten]].</w:t>
+      </w:r>
     </w:p>
     <w:p/>
     <w:p>
@@ -12386,7 +10999,7 @@
         <w:rPr>
           <w:highlight w:val="yellow"/>
         </w:rPr>
-        <w:t>[[SLOT_126: Das Unternehmen hat einen handelsrechtlich nicht bilanzierba]]</w:t>
+        <w:t>[[SLOT_065: Goodwill / Firmenwert Beschreibung und Bewertung]]</w:t>
       </w:r>
     </w:p>
     <w:p>
@@ -12431,7 +11044,7 @@
         <w:rPr>
           <w:highlight w:val="yellow"/>
         </w:rPr>
-        <w:t>[[SLOT_127: selbst geschaffene Schutzrechte Beschreibung/Wert]]</w:t>
+        <w:t>[[SLOT_066: Selbst geschaffene gewerbliche Schutzrechte Beschreibung/Wert]]</w:t>
       </w:r>
     </w:p>
     <w:p>
@@ -12471,7 +11084,7 @@
         <w:rPr>
           <w:highlight w:val="yellow"/>
         </w:rPr>
-        <w:t>[[SLOT_128: entgeltlich erworbene Rechte Beschreibung/Wert]]</w:t>
+        <w:t>[[SLOT_067: Entgeltlich erworbene Konzessionen und Schutzrechte Beschreibung/Wert]]</w:t>
       </w:r>
     </w:p>
     <w:p/>
@@ -12525,6 +11138,7 @@
         <w:rPr>
           <w:highlight w:val="yellow"/>
         </w:rPr>
+        <w:t>[[SLOT_068: Grundstücke und grundstücksgleiche Rechte - Beschreibung, Grundbuch, Verkehrswert, Belastungen]]</w:t>
       </w:r>
     </w:p>
     <w:p>
@@ -12566,6 +11180,7 @@
         <w:rPr>
           <w:highlight w:val="yellow"/>
         </w:rPr>
+        <w:t>[[SLOT_069: Technische Anlagen und Maschinen - Beschreibung, Bewertung]]</w:t>
       </w:r>
     </w:p>
     <w:p>
@@ -12602,6 +11217,7 @@
         <w:rPr>
           <w:highlight w:val="yellow"/>
         </w:rPr>
+        <w:t>[[SLOT_070: Betriebs- und Geschäftsausstattung - Beschreibung, Bewertung]]</w:t>
       </w:r>
     </w:p>
     <w:p/>
@@ -12660,7 +11276,7 @@
         <w:rPr>
           <w:highlight w:val="yellow"/>
         </w:rPr>
-        <w:t>[[SLOT_132: Anteile verbundene Unternehmen Beschreibung/Wert]]</w:t>
+        <w:t>[[SLOT_071: Anteile an verbundenen Unternehmen Beschreibung/Wert]]</w:t>
       </w:r>
     </w:p>
     <w:p>
@@ -12703,7 +11319,7 @@
         <w:rPr>
           <w:highlight w:val="yellow"/>
         </w:rPr>
-        <w:t>[[SLOT_133: Beteiligungen Beschreibung/Wert]]</w:t>
+        <w:t>[[SLOT_072: Beteiligungen Beschreibung/Wert]]</w:t>
       </w:r>
     </w:p>
     <w:p>
@@ -12741,7 +11357,7 @@
         <w:rPr>
           <w:highlight w:val="yellow"/>
         </w:rPr>
-        <w:t>[[SLOT_134: Wertpapiere Anlagevermögen Beschreibung/Wert]]</w:t>
+        <w:t>[[SLOT_073: Wertpapiere des Anlagevermögens Beschreibung/Wert]]</w:t>
       </w:r>
     </w:p>
     <w:p>
@@ -12819,6 +11435,7 @@
         <w:rPr>
           <w:highlight w:val="yellow"/>
         </w:rPr>
+        <w:t>[[SLOT_074: Roh-, Hilfs- und Betriebsstoffe Beschreibung/Wert]]</w:t>
       </w:r>
     </w:p>
     <w:p>
@@ -12867,6 +11484,7 @@
         <w:rPr>
           <w:highlight w:val="yellow"/>
         </w:rPr>
+        <w:t>[[SLOT_075: Unfertige Erzeugnisse, unfertige Leistungen Beschreibung/Wert]]</w:t>
       </w:r>
     </w:p>
     <w:p>
@@ -12909,6 +11527,7 @@
         <w:rPr>
           <w:highlight w:val="yellow"/>
         </w:rPr>
+        <w:t>[[SLOT_076: Fertige Erzeugnisse / Waren Beschreibung/Wert]]</w:t>
       </w:r>
     </w:p>
     <w:p/>
@@ -12932,18 +11551,9 @@
       <w:pPr>
         <w:textAlignment w:val="auto"/>
       </w:pPr>
-      <w:proofErr w:type="spellStart"/>
-      <w:r/>
-      <w:proofErr w:type="spellEnd"/>
-      <w:r/>
-      <w:r/>
-      <w:r/>
-      <w:r>
-        <w:rPr>
-          <w:highlight w:val="yellow"/>
-        </w:rPr>
-      </w:r>
-      <w:r/>
+      <w:r>
+        <w:t>[[SLOT_077: Forderungen aus Lieferungen und Leistungen - Bestand, Einbringlichkeit, Bewertung]]</w:t>
+      </w:r>
     </w:p>
     <w:p>
       <w:pPr>
@@ -12959,6 +11569,7 @@
         <w:rPr>
           <w:highlight w:val="yellow"/>
         </w:rPr>
+        <w:t/>
       </w:r>
     </w:p>
     <w:p>
@@ -12971,18 +11582,9 @@
       <w:pPr>
         <w:textAlignment w:val="auto"/>
       </w:pPr>
-      <w:proofErr w:type="spellStart"/>
-      <w:r/>
-      <w:proofErr w:type="spellEnd"/>
-      <w:r/>
-      <w:r/>
-      <w:r/>
-      <w:r>
-        <w:rPr>
-          <w:highlight w:val="yellow"/>
-        </w:rPr>
-      </w:r>
-      <w:r/>
+      <w:r>
+        <w:t>[[SLOT_078: Forderungen gegen verbundene Unternehmen]]</w:t>
+      </w:r>
     </w:p>
     <w:p>
       <w:pPr>
@@ -12999,6 +11601,7 @@
         <w:rPr>
           <w:highlight w:val="yellow"/>
         </w:rPr>
+        <w:t/>
       </w:r>
     </w:p>
     <w:p>
@@ -13036,7 +11639,7 @@
         <w:rPr>
           <w:highlight w:val="yellow"/>
         </w:rPr>
-        <w:t>[[SLOT_142: Forderungen Beteiligungsunternehmen]]</w:t>
+        <w:t>[[SLOT_079: Forderungen gegen Beteiligungsunternehmen]]</w:t>
       </w:r>
     </w:p>
     <w:p>
@@ -13079,7 +11682,7 @@
         <w:rPr>
           <w:highlight w:val="yellow"/>
         </w:rPr>
-        <w:t>[[SLOT_143: sonstige Vermögensgegenstände Beschreibung/Wert]]</w:t>
+        <w:t>[[SLOT_080: Sonstige Vermögensgegenstände Beschreibung/Wert]]</w:t>
       </w:r>
     </w:p>
     <w:p/>
@@ -13104,6 +11707,7 @@
         <w:rPr>
           <w:highlight w:val="yellow"/>
         </w:rPr>
+        <w:t>[[SLOT_081: Wertpapiere des Umlaufvermögens Beschreibung/Wert]]</w:t>
       </w:r>
     </w:p>
     <w:p/>
@@ -13123,18 +11727,9 @@
       <w:pPr>
         <w:textAlignment w:val="auto"/>
       </w:pPr>
-      <w:proofErr w:type="spellStart"/>
-      <w:r/>
-      <w:proofErr w:type="spellEnd"/>
-      <w:r/>
-      <w:r/>
-      <w:r/>
-      <w:r>
-        <w:rPr>
-          <w:highlight w:val="yellow"/>
-        </w:rPr>
-      </w:r>
-      <w:r/>
+      <w:r>
+        <w:t>[[SLOT_082: Kassenbestand]]</w:t>
+      </w:r>
     </w:p>
     <w:p>
       <w:pPr>
@@ -13151,6 +11746,7 @@
         <w:rPr>
           <w:highlight w:val="yellow"/>
         </w:rPr>
+        <w:t/>
       </w:r>
     </w:p>
     <w:p>
@@ -13163,18 +11759,9 @@
       <w:pPr>
         <w:textAlignment w:val="auto"/>
       </w:pPr>
-      <w:proofErr w:type="spellStart"/>
-      <w:r/>
-      <w:proofErr w:type="spellEnd"/>
-      <w:r/>
-      <w:r/>
-      <w:r/>
-      <w:r>
-        <w:rPr>
-          <w:highlight w:val="yellow"/>
-        </w:rPr>
-      </w:r>
-      <w:r/>
+      <w:r>
+        <w:t>[[SLOT_083: Bankguthaben bei Antragstellung mit Details pro Konto]]</w:t>
+      </w:r>
     </w:p>
     <w:p>
       <w:pPr>
@@ -13194,44 +11781,7 @@
         <w:rPr>
           <w:rFonts w:cs="Arial"/>
         </w:rPr>
-        <w:t xml:space="preserve">Der Unterzeichner hat bei der </w:t>
-      </w:r>
-      <w:bookmarkStart w:id="137" w:name="KI_Anderkonto_Bank"/>
-      <w:proofErr w:type="spellStart"/>
-      <w:r>
-        <w:rPr>
-          <w:rFonts w:cs="Arial"/>
-        </w:rPr>
-        <w:t>KI_Anderkonto_Bank</w:t>
-      </w:r>
-      <w:bookmarkEnd w:id="137"/>
-      <w:proofErr w:type="spellEnd"/>
-      <w:r>
-        <w:rPr>
-          <w:rFonts w:cs="Arial"/>
-        </w:rPr>
-        <w:t xml:space="preserve"> ein Insolvenz-Sonderkonto mit der IBAN: </w:t>
-      </w:r>
-      <w:bookmarkStart w:id="138" w:name="KI_ANDERKONTO_IBAN"/>
-      <w:r>
-        <w:rPr>
-          <w:rFonts w:cs="Arial"/>
-        </w:rPr>
-        <w:t>KI_ANDERKONTO_IBAN</w:t>
-      </w:r>
-      <w:bookmarkEnd w:id="138"/>
-      <w:r>
-        <w:rPr>
-          <w:rFonts w:cs="Arial"/>
-        </w:rPr>
-        <w:t xml:space="preserve"> eingerichtet. Das aktuelle Guthaben beträgt </w:t>
-      </w:r>
-      <w:r>
-        <w:rPr>
-          <w:rFonts w:cs="Arial"/>
-          <w:highlight w:val="yellow"/>
-        </w:rPr>
-        <w:t>… EUR.</w:t>
+        <w:t>Der Unterzeichner hat bei der KI_Anderkonto_Bank ein Insolvenz-Sonderkonto mit der IBAN: KI_ANDERKONTO_IBAN eingerichtet. Das aktuelle Guthaben beträgt [[SLOT_084: Guthaben Anderkonto]] EUR.</w:t>
       </w:r>
     </w:p>
     <w:p>
@@ -13255,71 +11805,7 @@
           <w:rFonts w:cs="Arial"/>
           <w:color w:val="FF0000"/>
         </w:rPr>
-        <w:t>Bei der [[SLOT_148: xy Bank]] wurde ein Festgeldkonto/Anderkonto/Rückstellungskonto mit der IBAN: xy eingerichtet. Das dortige Guthaben beläuft sich derzeit auf xx EUR.</w:t>
-      </w:r>
-      <w:r>
-        <w:rPr>
-          <w:rFonts w:cs="Arial"/>
-          <w:color w:val="FF0000"/>
-          <w:highlight w:val="yellow"/>
-        </w:rPr>
-      </w:r>
-      <w:proofErr w:type="spellStart"/>
-      <w:r>
-        <w:rPr>
-          <w:rFonts w:cs="Arial"/>
-          <w:color w:val="FF0000"/>
-          <w:highlight w:val="yellow"/>
-        </w:rPr>
-      </w:r>
-      <w:proofErr w:type="spellEnd"/>
-      <w:r>
-        <w:rPr>
-          <w:rFonts w:cs="Arial"/>
-          <w:color w:val="FF0000"/>
-          <w:highlight w:val="yellow"/>
-        </w:rPr>
-      </w:r>
-      <w:r>
-        <w:rPr>
-          <w:rFonts w:cs="Arial"/>
-          <w:color w:val="FF0000"/>
-        </w:rPr>
-      </w:r>
-      <w:r>
-        <w:rPr>
-          <w:rFonts w:cs="Arial"/>
-          <w:color w:val="FF0000"/>
-          <w:highlight w:val="yellow"/>
-        </w:rPr>
-      </w:r>
-      <w:proofErr w:type="spellStart"/>
-      <w:r>
-        <w:rPr>
-          <w:rFonts w:cs="Arial"/>
-          <w:color w:val="FF0000"/>
-          <w:highlight w:val="yellow"/>
-        </w:rPr>
-      </w:r>
-      <w:proofErr w:type="spellEnd"/>
-      <w:r>
-        <w:rPr>
-          <w:rFonts w:cs="Arial"/>
-          <w:color w:val="FF0000"/>
-        </w:rPr>
-      </w:r>
-      <w:r>
-        <w:rPr>
-          <w:rFonts w:cs="Arial"/>
-          <w:color w:val="FF0000"/>
-          <w:highlight w:val="yellow"/>
-        </w:rPr>
-      </w:r>
-      <w:r>
-        <w:rPr>
-          <w:rFonts w:cs="Arial"/>
-          <w:color w:val="FF0000"/>
-        </w:rPr>
+        <w:t>[[SLOT_085: Weitere Konten (Festgeld, Rückstellungskonto) mit IBAN und Guthaben]]</w:t>
       </w:r>
     </w:p>
     <w:p/>
@@ -13359,6 +11845,9 @@
           <w:highlight w:val="yellow"/>
         </w:rPr>
       </w:pPr>
+      <w:r>
+        <w:t>[[SLOT_086: Zusammenfassung Liquidationswerte]]</w:t>
+      </w:r>
     </w:p>
     <w:tbl>
       <w:tblPr>
@@ -13697,6 +12186,9 @@
           <w:highlight w:val="yellow"/>
         </w:rPr>
       </w:pPr>
+      <w:r>
+        <w:t>[[SLOT_087: Zusammenfassung Fortführungswerte]]</w:t>
+      </w:r>
     </w:p>
     <w:tbl>
       <w:tblPr>
@@ -14036,13 +12528,9 @@
       <w:pPr>
         <w:ind w:left="709"/>
       </w:pPr>
-      <w:r/>
-      <w:r>
-        <w:rPr>
-          <w:highlight w:val="yellow"/>
-        </w:rPr>
-      </w:r>
-      <w:r/>
+      <w:r>
+        <w:t>[[SLOT_088: Aussonderungsrechte Beschreibung]]</w:t>
+      </w:r>
     </w:p>
     <w:p>
       <w:pPr>
@@ -14057,7 +12545,7 @@
         <w:rPr>
           <w:highlight w:val="yellow"/>
         </w:rPr>
-        <w:t>[[SLOT_150: Tabelle]]</w:t>
+        <w:t>[[SLOT_089: Tabelle Aussonderung]]</w:t>
       </w:r>
     </w:p>
     <w:p/>
@@ -14085,13 +12573,9 @@
       <w:pPr>
         <w:ind w:left="709"/>
       </w:pPr>
-      <w:r/>
-      <w:r>
-        <w:rPr>
-          <w:highlight w:val="yellow"/>
-        </w:rPr>
-      </w:r>
-      <w:r/>
+      <w:r>
+        <w:t>[[SLOT_090: Absonderungsrechte Beschreibung]]</w:t>
+      </w:r>
     </w:p>
     <w:p/>
     <w:p>
@@ -14102,7 +12586,7 @@
         <w:rPr>
           <w:highlight w:val="yellow"/>
         </w:rPr>
-        <w:t>[[SLOT_152: Tabelle]]</w:t>
+        <w:t>[[SLOT_091: Tabelle Absonderung]]</w:t>
       </w:r>
     </w:p>
     <w:p/>
@@ -14137,7 +12621,7 @@
         <w:rPr>
           <w:highlight w:val="yellow"/>
         </w:rPr>
-        <w:t>[[SLOT_153: Tabelle]]</w:t>
+        <w:t>[[SLOT_092: Passiva-Tabelle mit Forderungsübersicht nach Kategorien]]</w:t>
       </w:r>
     </w:p>
     <w:p/>
@@ -14164,7 +12648,7 @@
         <w:rPr>
           <w:highlight w:val="yellow"/>
         </w:rPr>
-        <w:t>[[SLOT_154: Drittsicherheiten Beschreibung]]</w:t>
+        <w:t>[[SLOT_093: Drittsicherheiten - Bürgschaften, Patronatserklärungen, sonstige Sicherheiten Dritter]]</w:t>
       </w:r>
     </w:p>
     <w:p/>
@@ -14356,7 +12840,7 @@
         <w:rPr>
           <w:highlight w:val="yellow"/>
         </w:rPr>
-        <w:t>[[SLOT_157: Vorliegen Zahlungsunfähigkeit im konkreten Fall]]</w:t>
+        <w:t>[[SLOT_094: Vorliegen der Zahlungsunfähigkeit im konkreten Fall - Finanzstatus, Liquiditätslücke, fällige Verbindlichkeiten vs. verfügbare Mittel]]</w:t>
       </w:r>
     </w:p>
     <w:p/>
@@ -14425,44 +12909,7 @@
         <w:rPr>
           <w:highlight w:val="yellow"/>
         </w:rPr>
-      </w:r>
-      <w:r>
-        <w:rPr>
-          <w:highlight w:val="yellow"/>
-        </w:rPr>
-      </w:r>
-      <w:bookmarkStart w:id="155" w:name="KI_Verwalter_des_der_002"/>
-      <w:proofErr w:type="spellStart"/>
-      <w:r>
-        <w:rPr>
-          <w:highlight w:val="yellow"/>
-        </w:rPr>
-      </w:r>
-      <w:bookmarkEnd w:id="155"/>
-      <w:proofErr w:type="spellEnd"/>
-      <w:r>
-        <w:rPr>
-          <w:highlight w:val="yellow"/>
-        </w:rPr>
-      </w:r>
-      <w:bookmarkStart w:id="156" w:name="KI_Verwalter_Unterzeichner_Genitiv"/>
-      <w:proofErr w:type="spellStart"/>
-      <w:r>
-        <w:rPr>
-          <w:highlight w:val="yellow"/>
-        </w:rPr>
-      </w:r>
-      <w:bookmarkEnd w:id="156"/>
-      <w:proofErr w:type="spellEnd"/>
-      <w:r>
-        <w:rPr>
-          <w:highlight w:val="yellow"/>
-        </w:rPr>
-      </w:r>
-      <w:r>
-        <w:rPr>
-          <w:highlight w:val="yellow"/>
-        </w:rPr>
+        <w:t>[[SLOT_095: Eintritt der Insolvenzreife - Zeitpunkt und Begründung]]</w:t>
       </w:r>
     </w:p>
     <w:p>
@@ -14594,7 +13041,7 @@
         <w:rPr>
           <w:highlight w:val="yellow"/>
         </w:rPr>
-        <w:t>[[SLOT_160: Anfechtungsansprüche §§ 129 ff. InsO]]</w:t>
+        <w:t>[[SLOT_096: Anfechtungsansprüche §§ 129 ff. InsO - identifizierte anfechtbare Rechtshandlungen, Lookback-Zeiträume, Erfolgsaussichten und geschätztes Volumen]]</w:t>
       </w:r>
     </w:p>
     <w:p/>
@@ -14626,7 +13073,7 @@
         <w:rPr>
           <w:highlight w:val="yellow"/>
         </w:rPr>
-        <w:t>[[SLOT_161: Kostenbeiträge gem. § 171 InsO]]</w:t>
+        <w:t>[[SLOT_097: Kostenbeiträge gem. § 171 InsO - Sicherungsrechte und daraus resultierende Kostenbeiträge]]</w:t>
       </w:r>
     </w:p>
     <w:p/>
@@ -14655,21 +13102,9 @@
       <w:pPr>
         <w:ind w:left="709"/>
       </w:pPr>
-      <w:r/>
-      <w:r/>
-      <w:r/>
-      <w:r/>
-      <w:r/>
-      <w:r/>
-      <w:r/>
-      <w:r>
-        <w:rPr>
-          <w:highlight w:val="yellow"/>
-        </w:rPr>
-      </w:r>
-      <w:r/>
-      <w:r/>
-      <w:r/>
+      <w:r>
+        <w:t>[[SLOT_098: Zusammenfassung insolvenzspezifische Ansprüche - Gesamtüberblick Anfechtung + Kostenbeiträge]]</w:t>
+      </w:r>
     </w:p>
     <w:p/>
     <w:p/>
@@ -14695,54 +13130,17 @@
       <w:pPr>
         <w:ind w:left="709"/>
       </w:pPr>
-      <w:r/>
-      <w:r>
-        <w:rPr>
-          <w:highlight w:val="yellow"/>
-        </w:rPr>
-      </w:r>
-      <w:r/>
-      <w:r/>
-      <w:r/>
-      <w:r>
-        <w:rPr>
-          <w:highlight w:val="yellow"/>
-        </w:rPr>
-      </w:r>
-      <w:r/>
-      <w:r>
-        <w:rPr>
-          <w:highlight w:val="yellow"/>
-        </w:rPr>
-      </w:r>
-      <w:r/>
-      <w:r/>
-      <w:r/>
-      <w:r/>
-      <w:r/>
-      <w:r>
-        <w:rPr>
-          <w:highlight w:val="yellow"/>
-        </w:rPr>
-      </w:r>
-      <w:r/>
-      <w:r/>
-      <w:r/>
-      <w:r/>
-      <w:r>
-        <w:rPr>
-          <w:highlight w:val="yellow"/>
-        </w:rPr>
-      </w:r>
-      <w:r/>
-      <w:r/>
-      <w:r/>
-      <w:r/>
+      <w:r>
+        <w:t>[[SLOT_099: Verfahrenskostendeckung - Berechnung nach InsVV, Vergütung vorläufiges Verfahren, Vergütung eröffnetes Verfahren, Gerichtskosten, Gegenüberstellung mit verfügbarer Masse]]</w:t>
+      </w:r>
     </w:p>
     <w:p>
       <w:pPr>
         <w:ind w:left="349"/>
       </w:pPr>
+      <w:r>
+        <w:t/>
+      </w:r>
     </w:p>
     <w:tbl>
       <w:tblPr>
@@ -14793,10 +13191,8 @@
               <w:rPr>
                 <w:highlight w:val="yellow"/>
               </w:rPr>
-              <w:t>[[SLOT_190: Tabellenwert]] EUR</w:t>
+              <w:t>[[SLOT_100: Vergütung vorläufiges Verfahren]] EUR</w:t>
             </w:r>
-            <w:r/>
-            <w:r/>
           </w:p>
         </w:tc>
       </w:tr>
@@ -14829,10 +13225,8 @@
               <w:rPr>
                 <w:highlight w:val="yellow"/>
               </w:rPr>
-              <w:t>[[SLOT_192: Tabellenwert]] EUR</w:t>
+              <w:t>[[SLOT_101: Vergütung eröffnetes Verfahren]] EUR</w:t>
             </w:r>
-            <w:r/>
-            <w:r/>
           </w:p>
         </w:tc>
       </w:tr>
@@ -14865,10 +13259,8 @@
               <w:rPr>
                 <w:highlight w:val="yellow"/>
               </w:rPr>
-              <w:t>[[SLOT_194: Tabellenwert]] EUR</w:t>
+              <w:t>[[SLOT_102: Gerichtskosten]] EUR</w:t>
             </w:r>
-            <w:r/>
-            <w:r/>
           </w:p>
         </w:tc>
       </w:tr>
@@ -14911,17 +13303,7 @@
                 <w:b/>
                 <w:highlight w:val="yellow"/>
               </w:rPr>
-              <w:t>[[SLOT_196: Tabellenwert]] EUR</w:t>
-            </w:r>
-            <w:r>
-              <w:rPr>
-                <w:b/>
-              </w:rPr>
-            </w:r>
-            <w:r>
-              <w:rPr>
-                <w:b/>
-              </w:rPr>
+              <w:t>KI_Verfahrenskosten_Gesamt EUR</w:t>
             </w:r>
           </w:p>
         </w:tc>
@@ -14931,33 +13313,25 @@
       <w:pPr>
         <w:ind w:left="349"/>
       </w:pPr>
+      <w:r>
+        <w:t/>
+      </w:r>
     </w:p>
     <w:p>
       <w:pPr>
         <w:ind w:left="709"/>
       </w:pPr>
-      <w:r/>
-      <w:r>
-        <w:rPr>
-          <w:highlight w:val="yellow"/>
-        </w:rPr>
-      </w:r>
-      <w:r/>
-      <w:r/>
-      <w:r/>
-      <w:r>
-        <w:rPr>
-          <w:highlight w:val="yellow"/>
-        </w:rPr>
-      </w:r>
-      <w:r/>
-      <w:r/>
-      <w:r/>
+      <w:r>
+        <w:t/>
+      </w:r>
     </w:p>
     <w:p>
       <w:pPr>
         <w:ind w:left="709"/>
       </w:pPr>
+      <w:r>
+        <w:t/>
+      </w:r>
     </w:p>
     <w:p>
       <w:pPr>
@@ -14967,56 +13341,19 @@
         <w:rPr>
           <w:highlight w:val="yellow"/>
         </w:rPr>
-      </w:r>
-      <w:proofErr w:type="spellStart"/>
-      <w:r>
-        <w:rPr>
-          <w:highlight w:val="yellow"/>
-        </w:rPr>
-      </w:r>
-      <w:proofErr w:type="spellEnd"/>
-      <w:r>
-        <w:rPr>
-          <w:highlight w:val="yellow"/>
-        </w:rPr>
-      </w:r>
-      <w:proofErr w:type="spellStart"/>
-      <w:r>
-        <w:rPr>
-          <w:highlight w:val="yellow"/>
-        </w:rPr>
-      </w:r>
-      <w:proofErr w:type="spellEnd"/>
-      <w:r>
-        <w:rPr>
-          <w:highlight w:val="yellow"/>
-        </w:rPr>
-      </w:r>
-      <w:r>
-        <w:rPr>
-          <w:highlight w:val="yellow"/>
-        </w:rPr>
-      </w:r>
-      <w:r>
-        <w:rPr>
-          <w:highlight w:val="yellow"/>
-        </w:rPr>
-      </w:r>
-      <w:proofErr w:type="spellStart"/>
-      <w:r>
-        <w:rPr>
-          <w:highlight w:val="yellow"/>
-        </w:rPr>
-      </w:r>
-      <w:proofErr w:type="spellEnd"/>
-      <w:r>
-        <w:rPr>
-          <w:highlight w:val="yellow"/>
-        </w:rPr>
-      </w:r>
-    </w:p>
-    <w:p/>
-    <w:p/>
+        <w:t/>
+      </w:r>
+    </w:p>
+    <w:p>
+      <w:r>
+        <w:t/>
+      </w:r>
+    </w:p>
+    <w:p>
+      <w:r>
+        <w:t/>
+      </w:r>
+    </w:p>
     <w:p>
       <w:pPr>
         <w:pStyle w:val="berschrift1"/>
@@ -15055,7 +13392,7 @@
         <w:rPr>
           <w:highlight w:val="yellow"/>
         </w:rPr>
-        <w:t>[[SLOT_171: Ergebnis und Empfehlung des Gutachters]]</w:t>
+        <w:t>[[SLOT_103: Ergebnis und Empfehlung - Nummerierte Feststellungen (1. Zahlungsunfähigkeit, 2. Kostendeckung, 3. Sicherungsmaßnahmen) und abschließende Empfehlung zur Eröffnung]]</w:t>
       </w:r>
     </w:p>
     <w:p>
@@ -15077,26 +13414,9 @@
       <w:pPr>
         <w:spacing w:line="240" w:lineRule="auto"/>
       </w:pPr>
-      <w:bookmarkStart w:id="168" w:name="KI_Verwalter_Diktatzeichen_002"/>
-      <w:proofErr w:type="spellStart"/>
-      <w:r>
-        <w:t>KI_Verwalter_Diktatzeichen</w:t>
-      </w:r>
-      <w:bookmarkEnd w:id="168"/>
-      <w:proofErr w:type="spellEnd"/>
-      <w:r>
-        <w:t xml:space="preserve"> </w:t>
-      </w:r>
-      <w:bookmarkStart w:id="169" w:name="KI_Verwalter_Name_002"/>
-      <w:proofErr w:type="spellStart"/>
       <w:r>
         <w:t>KI_Verwalter_Name</w:t>
       </w:r>
-      <w:bookmarkEnd w:id="169"/>
-      <w:proofErr w:type="spellEnd"/>
-      <w:r>
-        <w:t xml:space="preserve"> </w:t>
-      </w:r>
     </w:p>
     <w:p>
       <w:pPr>
@@ -15109,19 +13429,7 @@
         <w:rPr>
           <w:highlight w:val="yellow"/>
         </w:rPr>
-        <w:t xml:space="preserve">als </w:t>
-      </w:r>
-      <w:r>
-        <w:rPr>
-          <w:highlight w:val="yellow"/>
-        </w:rPr>
-        <w:t>Sachverständiger</w:t>
-      </w:r>
-      <w:r>
-        <w:rPr>
-          <w:highlight w:val="yellow"/>
-        </w:rPr>
-        <w:t xml:space="preserve"> und vorläufiger Insolvenzverwalter</w:t>
+        <w:t>als Sachverständiger und vorläufiger Insolvenzverwalter</w:t>
       </w:r>
     </w:p>
     <w:p>
@@ -15132,7 +13440,7 @@
         <w:rPr>
           <w:highlight w:val="yellow"/>
         </w:rPr>
-        <w:t>als Sachverständige und vorläufige Insolvenzverwalterin</w:t>
+        <w:t/>
       </w:r>
     </w:p>
     <w:p/>
@@ -15198,7 +13506,7 @@
               <w:rPr>
                 <w:highlight w:val="yellow"/>
               </w:rPr>
-              <w:t>[[SLOT_198: Tabellenwert]]</w:t>
+              <w:t>[[SLOT_104: Anlage I Bezeichnung]]</w:t>
             </w:r>
           </w:p>
         </w:tc>
@@ -15231,7 +13539,7 @@
               <w:rPr>
                 <w:highlight w:val="yellow"/>
               </w:rPr>
-              <w:t>[[SLOT_200: Tabellenwert]]</w:t>
+              <w:t>[[SLOT_105: Anlage II Bezeichnung]]</w:t>
             </w:r>
           </w:p>
         </w:tc>
@@ -15264,7 +13572,7 @@
               <w:rPr>
                 <w:highlight w:val="yellow"/>
               </w:rPr>
-              <w:t>[[SLOT_202: Tabellenwert]]</w:t>
+              <w:t>[[SLOT_106: Anlage III Bezeichnung]]</w:t>
             </w:r>
           </w:p>
         </w:tc>
@@ -15297,7 +13605,7 @@
               <w:rPr>
                 <w:highlight w:val="yellow"/>
               </w:rPr>
-              <w:t>[[SLOT_204: Tabellenwert]]</w:t>
+              <w:t>[[SLOT_107: Anlage IV Bezeichnung]]</w:t>
             </w:r>
           </w:p>
         </w:tc>
@@ -15330,7 +13638,7 @@
               <w:rPr>
                 <w:highlight w:val="yellow"/>
               </w:rPr>
-              <w:t>[[SLOT_206: Tabellenwert]]</w:t>
+              <w:t>[[SLOT_108: Anlage V Bezeichnung]]</w:t>
             </w:r>
           </w:p>
         </w:tc>

</xml_diff>

<commit_message>
fix: center Schuldner block on cover page and Auftrag section
Co-Authored-By: Claude Opus 4.6 (1M context) <noreply@anthropic.com>
</commit_message>
<xml_diff>
--- a/gutachtenvorlagen/Gutachten Muster natürliche Person.docx
+++ b/gutachtenvorlagen/Gutachten Muster natürliche Person.docx
@@ -55,7 +55,11 @@
         <w:t>in dem Insolvenzantragsverfahren über das Vermögen KI_Schuldner_des_der</w:t>
       </w:r>
     </w:p>
-    <w:p/>
+    <w:p>
+      <w:pPr>
+        <w:jc w:val="center"/>
+      </w:pPr>
+    </w:p>
     <w:p>
       <w:pPr>
         <w:jc w:val="center"/>
@@ -6156,6 +6160,9 @@
       </w:r>
     </w:p>
     <w:p>
+      <w:pPr>
+        <w:jc w:val="center"/>
+      </w:pPr>
       <w:r>
         <w:t>geb. KI_Schuldner_Geburtsdatum</w:t>
       </w:r>
@@ -6163,6 +6170,7 @@
     <w:p>
       <w:pPr>
         <w:ind w:left="709"/>
+        <w:jc w:val="center"/>
       </w:pPr>
       <w:r>
         <w:t>KI_Schuldner_Adr</w:t>
@@ -6171,6 +6179,7 @@
     <w:p>
       <w:pPr>
         <w:ind w:left="709"/>
+        <w:jc w:val="center"/>
       </w:pPr>
       <w:r>
         <w:t/>
@@ -6179,6 +6188,7 @@
     <w:p>
       <w:pPr>
         <w:ind w:left="709"/>
+        <w:jc w:val="center"/>
       </w:pPr>
       <w:r>
         <w:rPr>
@@ -6190,6 +6200,7 @@
     <w:p>
       <w:pPr>
         <w:ind w:left="709"/>
+        <w:jc w:val="center"/>
       </w:pPr>
       <w:r>
         <w:t>KI_Schuldner_Betriebsstaette</w:t>
@@ -6198,11 +6209,13 @@
     <w:p>
       <w:pPr>
         <w:ind w:left="709"/>
+        <w:jc w:val="center"/>
       </w:pPr>
     </w:p>
     <w:p>
       <w:pPr>
         <w:ind w:left="709"/>
+        <w:jc w:val="center"/>
       </w:pPr>
       <w:r>
         <w:t>- nachfolgend „Antragsteller“ -</w:t>

</xml_diff>

<commit_message>
fix: heading fixes — add Arbeitsrechtliche H3, fix Schuldner heading
- Added missing 'Arbeitsrechtliche Verhältnisse' H3 heading + SLOT
- Fixed 'Angaben zum Schuldner/zur Schuldnerin' → 'Angaben zum Schuldner und Statistische Angaben'
- Cleared corrupted TOC entries

Co-Authored-By: Claude Opus 4.6 (1M context) <noreply@anthropic.com>
</commit_message>
<xml_diff>
--- a/gutachtenvorlagen/Gutachten Muster natürliche Person.docx
+++ b/gutachtenvorlagen/Gutachten Muster natürliche Person.docx
@@ -2435,29 +2435,29 @@
       <w:bookmarkStart w:id="44" w:name="_Toc3475018"/>
       <w:bookmarkStart w:id="45" w:name="_Toc202967925"/>
       <w:r>
-        <w:t xml:space="preserve">Angaben </w:t>
+        <w:t xml:space="preserve">Angaben zum Schuldner und Statistische Angaben</w:t>
       </w:r>
       <w:r>
         <w:rPr>
           <w:highlight w:val="yellow"/>
         </w:rPr>
-        <w:t>zum Schuldner/</w:t>
+        <w:t/>
       </w:r>
       <w:r>
         <w:rPr>
           <w:highlight w:val="yellow"/>
         </w:rPr>
-        <w:t>zur Schuldner</w:t>
+        <w:t/>
       </w:r>
       <w:bookmarkEnd w:id="44"/>
       <w:r>
         <w:rPr>
           <w:highlight w:val="yellow"/>
         </w:rPr>
-        <w:t>in</w:t>
-      </w:r>
-      <w:r>
-        <w:t xml:space="preserve"> / Statistische Angaben</w:t>
+        <w:t/>
+      </w:r>
+      <w:r>
+        <w:t xml:space="preserve"/>
       </w:r>
       <w:bookmarkEnd w:id="45"/>
     </w:p>
@@ -5198,6 +5198,45 @@
       </w:r>
     </w:p>
     <w:p/>
+    <w:p>
+      <w:pPr>
+        <w:pStyle w:val="berschrift3"/>
+        <w:numPr>
+          <w:ilvl w:val="0"/>
+          <w:numId w:val="17"/>
+        </w:numPr>
+        <w:rPr>
+          <w:highlight w:val="yellow"/>
+        </w:rPr>
+      </w:pPr>
+      <w:bookmarkStart w:id="81" w:name="_Toc3475025"/>
+      <w:bookmarkStart w:id="82" w:name="_Toc202967939"/>
+      <w:r>
+        <w:rPr>
+          <w:highlight w:val="yellow"/>
+        </w:rPr>
+        <w:t>Arbeitsrechtliche Verhältnisse</w:t>
+      </w:r>
+      <w:r>
+        <w:rPr>
+          <w:highlight w:val="yellow"/>
+        </w:rPr>
+        <w:t>ietverträge</w:t>
+      </w:r>
+      <w:bookmarkEnd w:id="81"/>
+      <w:r>
+        <w:rPr>
+          <w:highlight w:val="yellow"/>
+        </w:rPr>
+        <w:t xml:space="preserve"> / Pachtverträge</w:t>
+      </w:r>
+      <w:bookmarkEnd w:id="82"/>
+    </w:p>
+    <w:p>
+      <w:pPr>
+        <w:ind w:left="360"/>
+      </w:pPr>
+    </w:p>
     <w:p>
       <w:pPr>
         <w:pStyle w:val="berschrift3"/>

</xml_diff>

<commit_message>
fix: fix 4 TOC entries with KI_ variables, remove duplicates
- Schuldner/zur Schuldnerin → Schuldner und Statistische Angaben
- Örtliche Zuständigkeit: de-duplicated, uses KI_Gericht_Ort
- Arbeitsrechtliche H3: removed editorial [wenn...] text
- Removed duplicate IV.Arbeitsrechtliche with leaked slot content

Co-Authored-By: Claude Opus 4.6 (1M context) <noreply@anthropic.com>
</commit_message>
<xml_diff>
--- a/gutachtenvorlagen/Gutachten Muster natürliche Person.docx
+++ b/gutachtenvorlagen/Gutachten Muster natürliche Person.docx
@@ -1720,7 +1720,7 @@
             <w:rStyle w:val="Hyperlink"/>
             <w:noProof/>
           </w:rPr>
-          <w:t>I.</w:t>
+          <w:t>I.Angaben zum Schuldner und Statistische Angaben7</w:t>
         </w:r>
         <w:r>
           <w:rPr>
@@ -1734,7 +1734,7 @@
             <w:rStyle w:val="Hyperlink"/>
             <w:noProof/>
           </w:rPr>
-          <w:t xml:space="preserve">Angaben </w:t>
+          <w:t xml:space="preserve"/>
         </w:r>
         <w:r>
           <w:rPr>
@@ -1742,14 +1742,14 @@
             <w:noProof/>
             <w:highlight w:val="yellow"/>
           </w:rPr>
-          <w:t>zum Schuldner/zur Schuldnerin</w:t>
+          <w:t/>
         </w:r>
         <w:r>
           <w:rPr>
             <w:rStyle w:val="Hyperlink"/>
             <w:noProof/>
           </w:rPr>
-          <w:t xml:space="preserve"> / Statistische Angaben</w:t>
+          <w:t xml:space="preserve"/>
         </w:r>
         <w:r>
           <w:rPr>
@@ -1790,7 +1790,7 @@
             <w:noProof/>
             <w:webHidden/>
           </w:rPr>
-          <w:t>7</w:t>
+          <w:t/>
         </w:r>
         <w:r>
           <w:rPr>
@@ -2241,7 +2241,7 @@
             <w:rStyle w:val="Hyperlink"/>
             <w:noProof/>
           </w:rPr>
-          <w:t>2.</w:t>
+          <w:t>2.Örtliche Zuständigkeit des Amtsgerichts KI_Gericht_Ort, gem. § 3 Abs. 1 InsO11</w:t>
         </w:r>
         <w:r>
           <w:rPr>
@@ -2255,7 +2255,7 @@
             <w:rStyle w:val="Hyperlink"/>
             <w:noProof/>
           </w:rPr>
-          <w:t xml:space="preserve">Örtliche Zuständigkeit des Amtsgerichts </w:t>
+          <w:t xml:space="preserve"/>
         </w:r>
         <w:r>
           <w:rPr>
@@ -2263,14 +2263,14 @@
             <w:noProof/>
             <w:highlight w:val="yellow"/>
           </w:rPr>
-          <w:t>KI_Gericht_Ort</w:t>
+          <w:t/>
         </w:r>
         <w:r>
           <w:rPr>
             <w:rStyle w:val="Hyperlink"/>
             <w:noProof/>
           </w:rPr>
-          <w:t>, gem. § 3 Abs. 1 InsO</w:t>
+          <w:t/>
         </w:r>
         <w:r>
           <w:rPr>
@@ -2311,7 +2311,7 @@
             <w:noProof/>
             <w:webHidden/>
           </w:rPr>
-          <w:t>11</w:t>
+          <w:t/>
         </w:r>
         <w:r>
           <w:rPr>
@@ -2322,15 +2322,15 @@
         </w:r>
       </w:hyperlink>
       <w:r>
-        <w:t>2.</w:t>
+        <w:t/>
         <w:tab/>
-        <w:t>Örtliche Zuständigkeit des Amtsgerichts KI_Gericht_Ort, gem. § 3 Abs. 1 InsO</w:t>
+        <w:t/>
         <w:tab/>
-        <w:t>112.</w:t>
+        <w:t/>
         <w:tab/>
-        <w:t>Örtliche Zuständigkeit des Amtsgerichts KI_Gericht_Ort, gem. § 3 Abs. 1 InsO</w:t>
+        <w:t/>
         <w:tab/>
-        <w:t>11</w:t>
+        <w:t/>
       </w:r>
     </w:p>
     <w:p>
@@ -2859,7 +2859,7 @@
             <w:rStyle w:val="Hyperlink"/>
             <w:noProof/>
           </w:rPr>
-          <w:t>1.</w:t>
+          <w:t>1.Arbeitsrechtliche Verhältnisse14</w:t>
         </w:r>
         <w:r>
           <w:rPr>
@@ -2873,7 +2873,7 @@
             <w:rStyle w:val="Hyperlink"/>
             <w:noProof/>
           </w:rPr>
-          <w:t xml:space="preserve">Arbeitsrechtliche Verhältnisse </w:t>
+          <w:t xml:space="preserve"/>
         </w:r>
         <w:r>
           <w:rPr>
@@ -2881,7 +2881,7 @@
             <w:noProof/>
             <w:highlight w:val="yellow"/>
           </w:rPr>
-          <w:t>[wenn überschaubare arbeitsrechtliche Verhältnisse, ansonsten extra Gliederungspunkt unter III.]</w:t>
+          <w:t/>
         </w:r>
         <w:r>
           <w:rPr>
@@ -2922,7 +2922,7 @@
             <w:noProof/>
             <w:webHidden/>
           </w:rPr>
-          <w:t>12</w:t>
+          <w:t/>
         </w:r>
         <w:r>
           <w:rPr>
@@ -2933,11 +2933,11 @@
         </w:r>
       </w:hyperlink>
       <w:r>
-        <w:t>1.</w:t>
+        <w:t/>
         <w:tab/>
-        <w:t>Arbeitsrechtliche Verhältnisse [[SLOT_081: wenn überschaubare arbeitsrechtliche Verhältnisse, ansonsten]]</w:t>
+        <w:t/>
         <w:tab/>
-        <w:t>12</w:t>
+        <w:t/>
       </w:r>
     </w:p>
     <w:p>
@@ -3466,7 +3466,7 @@
             <w:rStyle w:val="Hyperlink"/>
             <w:noProof/>
           </w:rPr>
-          <w:t>IV.</w:t>
+          <w:t/>
         </w:r>
         <w:r>
           <w:rPr>
@@ -3480,7 +3480,7 @@
             <w:rStyle w:val="Hyperlink"/>
             <w:noProof/>
           </w:rPr>
-          <w:t xml:space="preserve">Arbeitsrechtliche Verhältnisse </w:t>
+          <w:t xml:space="preserve"/>
         </w:r>
         <w:r>
           <w:rPr>
@@ -3488,7 +3488,7 @@
             <w:noProof/>
             <w:highlight w:val="yellow"/>
           </w:rPr>
-          <w:t>[wenn größerer Betrieb]</w:t>
+          <w:t/>
         </w:r>
         <w:r>
           <w:rPr>
@@ -3529,7 +3529,7 @@
             <w:noProof/>
             <w:webHidden/>
           </w:rPr>
-          <w:t>13</w:t>
+          <w:t/>
         </w:r>
         <w:r>
           <w:rPr>
@@ -3540,11 +3540,11 @@
         </w:r>
       </w:hyperlink>
       <w:r>
-        <w:t>IV.</w:t>
+        <w:t/>
         <w:tab/>
-        <w:t>Arbeitsrechtliche Verhältnisse [[SLOT_082: wenn größerer Betrieb]]</w:t>
+        <w:t/>
         <w:tab/>
-        <w:t>13</w:t>
+        <w:t/>
       </w:r>
     </w:p>
     <w:p>

</xml_diff>

<commit_message>
fix: TOC spacing and numbering — Örtliche Zuständigkeit as 1., tabs
Co-Authored-By: Claude Opus 4.6 (1M context) <noreply@anthropic.com>
</commit_message>
<xml_diff>
--- a/gutachtenvorlagen/Gutachten Muster natürliche Person.docx
+++ b/gutachtenvorlagen/Gutachten Muster natürliche Person.docx
@@ -1720,7 +1720,7 @@
             <w:rStyle w:val="Hyperlink"/>
             <w:noProof/>
           </w:rPr>
-          <w:t>I.Angaben zum Schuldner und Statistische Angaben7</w:t>
+          <w:t>I.	Angaben zum Schuldner und Statistische Angaben	7</w:t>
         </w:r>
         <w:r>
           <w:rPr>
@@ -2156,7 +2156,7 @@
             <w:noProof/>
             <w:highlight w:val="yellow"/>
           </w:rPr>
-          <w:t>1.</w:t>
+          <w:t>1.	Örtliche Zuständigkeit des Amtsgerichts KI_Gericht_Ort, gem. § 3 Abs. 1 InsO	11</w:t>
         </w:r>
         <w:r>
           <w:rPr>
@@ -2171,7 +2171,7 @@
             <w:noProof/>
             <w:highlight w:val="yellow"/>
           </w:rPr>
-          <w:t>Internationale Zuständigkeit deutscher Gerichte</w:t>
+          <w:t/>
         </w:r>
         <w:r>
           <w:rPr>
@@ -2212,7 +2212,7 @@
             <w:noProof/>
             <w:webHidden/>
           </w:rPr>
-          <w:t>10</w:t>
+          <w:t/>
         </w:r>
         <w:r>
           <w:rPr>
@@ -2241,7 +2241,7 @@
             <w:rStyle w:val="Hyperlink"/>
             <w:noProof/>
           </w:rPr>
-          <w:t>2.Örtliche Zuständigkeit des Amtsgerichts KI_Gericht_Ort, gem. § 3 Abs. 1 InsO11</w:t>
+          <w:t>2.	Sicherungsmaßnahmen	11</w:t>
         </w:r>
         <w:r>
           <w:rPr>
@@ -2351,7 +2351,7 @@
             <w:rStyle w:val="Hyperlink"/>
             <w:noProof/>
           </w:rPr>
-          <w:t>3.</w:t>
+          <w:t/>
         </w:r>
         <w:r>
           <w:rPr>
@@ -2365,7 +2365,7 @@
             <w:rStyle w:val="Hyperlink"/>
             <w:noProof/>
           </w:rPr>
-          <w:t>Sicherungsmaßnahmen</w:t>
+          <w:t/>
         </w:r>
         <w:r>
           <w:rPr>
@@ -2406,7 +2406,7 @@
             <w:noProof/>
             <w:webHidden/>
           </w:rPr>
-          <w:t>11</w:t>
+          <w:t/>
         </w:r>
         <w:r>
           <w:rPr>

</xml_diff>